<commit_message>
newest db and finish danh muc
</commit_message>
<xml_diff>
--- a/Báo cáo nhóm 12.docx
+++ b/Báo cáo nhóm 12.docx
@@ -360,7 +360,7 @@
           </mc:Choice>
           <mc:Fallback>
             <w:pict>
-              <v:shape w14:anchorId="50758A62" id="Graphic 1" o:spid="_x0000_s1026" style="position:absolute;margin-left:272.55pt;margin-top:11pt;width:21.65pt;height:.1pt;z-index:251528704;visibility:visible;mso-wrap-style:square;mso-wrap-distance-left:0;mso-wrap-distance-top:0;mso-wrap-distance-right:0;mso-wrap-distance-bottom:0;mso-position-horizontal:absolute;mso-position-horizontal-relative:page;mso-position-vertical:absolute;mso-position-vertical-relative:text;v-text-anchor:top" coordsize="274955,1270" o:gfxdata="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" path="m,l274326,e" filled="f" strokeweight=".33831mm">
+              <v:shape w14:anchorId="22BD5589" id="Graphic 1" o:spid="_x0000_s1026" style="position:absolute;margin-left:272.55pt;margin-top:11pt;width:21.65pt;height:.1pt;z-index:251528704;visibility:visible;mso-wrap-style:square;mso-wrap-distance-left:0;mso-wrap-distance-top:0;mso-wrap-distance-right:0;mso-wrap-distance-bottom:0;mso-position-horizontal:absolute;mso-position-horizontal-relative:page;mso-position-vertical:absolute;mso-position-vertical-relative:text;v-text-anchor:top" coordsize="274955,1270" o:gfxdata="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" path="m,l274326,e" filled="f" strokeweight=".33831mm">
                 <v:stroke dashstyle="dash"/>
                 <v:path arrowok="t"/>
                 <w10:wrap anchorx="page"/>
@@ -441,7 +441,7 @@
           </mc:Choice>
           <mc:Fallback>
             <w:pict>
-              <v:shape w14:anchorId="3D800DB9" id="Graphic 2" o:spid="_x0000_s1026" style="position:absolute;margin-left:311.55pt;margin-top:11pt;width:21.65pt;height:.1pt;z-index:251530752;visibility:visible;mso-wrap-style:square;mso-wrap-distance-left:0;mso-wrap-distance-top:0;mso-wrap-distance-right:0;mso-wrap-distance-bottom:0;mso-position-horizontal:absolute;mso-position-horizontal-relative:page;mso-position-vertical:absolute;mso-position-vertical-relative:text;v-text-anchor:top" coordsize="274955,1270" o:gfxdata="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" path="m,l274326,e" filled="f" strokeweight=".33831mm">
+              <v:shape w14:anchorId="5418E1C0" id="Graphic 2" o:spid="_x0000_s1026" style="position:absolute;margin-left:311.55pt;margin-top:11pt;width:21.65pt;height:.1pt;z-index:251530752;visibility:visible;mso-wrap-style:square;mso-wrap-distance-left:0;mso-wrap-distance-top:0;mso-wrap-distance-right:0;mso-wrap-distance-bottom:0;mso-position-horizontal:absolute;mso-position-horizontal-relative:page;mso-position-vertical:absolute;mso-position-vertical-relative:text;v-text-anchor:top" coordsize="274955,1270" o:gfxdata="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" path="m,l274326,e" filled="f" strokeweight=".33831mm">
                 <v:stroke dashstyle="dash"/>
                 <v:path arrowok="t"/>
                 <w10:wrap anchorx="page"/>
@@ -9984,16 +9984,52 @@
               <w:rPr>
                 <w:sz w:val="26"/>
                 <w:szCs w:val="26"/>
-                <w:lang w:val="vi-VN"/>
-              </w:rPr>
-            </w:pPr>
-            <w:r>
-              <w:rPr>
-                <w:sz w:val="26"/>
-                <w:szCs w:val="26"/>
-                <w:lang w:val="vi-VN"/>
-              </w:rPr>
-              <w:t>  TongTien (check &gt; 0), NOT NULL</w:t>
+                <w:lang w:val="en-US"/>
+              </w:rPr>
+            </w:pPr>
+            <w:r>
+              <w:rPr>
+                <w:sz w:val="26"/>
+                <w:szCs w:val="26"/>
+                <w:lang w:val="vi-VN"/>
+              </w:rPr>
+              <w:t>  </w:t>
+            </w:r>
+            <w:proofErr w:type="spellStart"/>
+            <w:r>
+              <w:rPr>
+                <w:sz w:val="26"/>
+                <w:szCs w:val="26"/>
+                <w:lang w:val="vi-VN"/>
+              </w:rPr>
+              <w:t>TongTien</w:t>
+            </w:r>
+            <w:proofErr w:type="spellEnd"/>
+            <w:r>
+              <w:rPr>
+                <w:sz w:val="26"/>
+                <w:szCs w:val="26"/>
+                <w:lang w:val="vi-VN"/>
+              </w:rPr>
+              <w:t xml:space="preserve"> (</w:t>
+            </w:r>
+            <w:proofErr w:type="spellStart"/>
+            <w:r>
+              <w:rPr>
+                <w:sz w:val="26"/>
+                <w:szCs w:val="26"/>
+                <w:lang w:val="vi-VN"/>
+              </w:rPr>
+              <w:t>check</w:t>
+            </w:r>
+            <w:proofErr w:type="spellEnd"/>
+            <w:r>
+              <w:rPr>
+                <w:sz w:val="26"/>
+                <w:szCs w:val="26"/>
+                <w:lang w:val="vi-VN"/>
+              </w:rPr>
+              <w:t xml:space="preserve"> &gt; 0)</w:t>
             </w:r>
           </w:p>
           <w:p>
@@ -10014,22 +10050,6 @@
               </w:rPr>
               <w:t>  TienKhachDua (check&gt;0)</w:t>
             </w:r>
-            <w:r>
-              <w:rPr>
-                <w:sz w:val="26"/>
-                <w:szCs w:val="26"/>
-                <w:lang w:val="en-US"/>
-              </w:rPr>
-              <w:t xml:space="preserve">, </w:t>
-            </w:r>
-            <w:r>
-              <w:rPr>
-                <w:sz w:val="26"/>
-                <w:szCs w:val="26"/>
-                <w:lang w:val="vi-VN"/>
-              </w:rPr>
-              <w:t>NOT NULL</w:t>
-            </w:r>
           </w:p>
           <w:p>
             <w:pPr>
@@ -10048,22 +10068,6 @@
                 <w:lang w:val="vi-VN"/>
               </w:rPr>
               <w:t>TienThoi (check &gt;= 0)</w:t>
-            </w:r>
-            <w:r>
-              <w:rPr>
-                <w:sz w:val="26"/>
-                <w:szCs w:val="26"/>
-                <w:lang w:val="en-US"/>
-              </w:rPr>
-              <w:t xml:space="preserve">, </w:t>
-            </w:r>
-            <w:r>
-              <w:rPr>
-                <w:sz w:val="26"/>
-                <w:szCs w:val="26"/>
-                <w:lang w:val="vi-VN"/>
-              </w:rPr>
-              <w:t>NOT NULL</w:t>
             </w:r>
           </w:p>
           <w:p>
@@ -10182,24 +10186,23 @@
               </w:rPr>
               <w:t> </w:t>
             </w:r>
-          </w:p>
-          <w:p>
-            <w:pPr>
-              <w:spacing w:before="209"/>
-              <w:ind w:left="459"/>
-              <w:rPr>
-                <w:sz w:val="26"/>
-                <w:szCs w:val="26"/>
-                <w:lang w:val="vi-VN"/>
-              </w:rPr>
-            </w:pPr>
-            <w:r>
-              <w:rPr>
-                <w:sz w:val="26"/>
-                <w:szCs w:val="26"/>
-                <w:lang w:val="vi-VN"/>
-              </w:rPr>
-              <w:t>Khoá chính (MaHoaDon)</w:t>
+            <w:proofErr w:type="spellStart"/>
+            <w:r>
+              <w:rPr>
+                <w:sz w:val="26"/>
+                <w:szCs w:val="26"/>
+                <w:lang w:val="vi-VN"/>
+              </w:rPr>
+              <w:t>Khoá</w:t>
+            </w:r>
+            <w:proofErr w:type="spellEnd"/>
+            <w:r>
+              <w:rPr>
+                <w:sz w:val="26"/>
+                <w:szCs w:val="26"/>
+                <w:lang w:val="vi-VN"/>
+              </w:rPr>
+              <w:t xml:space="preserve"> chính (MaHoaDon)</w:t>
             </w:r>
           </w:p>
           <w:p>
@@ -19104,7 +19107,7 @@
         <w:jc w:val="center"/>
         <w:rPr>
           <w:spacing w:val="-3"/>
-          <w:lang w:val="en-US"/>
+          <w:lang w:val="vi-VN"/>
         </w:rPr>
       </w:pPr>
       <w:r>
@@ -19155,120 +19158,18 @@
         <w:rPr>
           <w:sz w:val="26"/>
           <w:szCs w:val="26"/>
-          <w:lang w:val="en-US"/>
-        </w:rPr>
-      </w:pPr>
-      <w:proofErr w:type="spellStart"/>
+          <w:lang w:val="vi-VN"/>
+        </w:rPr>
+      </w:pPr>
       <w:r>
         <w:rPr>
           <w:spacing w:val="-3"/>
           <w:sz w:val="26"/>
           <w:szCs w:val="26"/>
-          <w:lang w:val="en-US"/>
-        </w:rPr>
-        <w:t>Kết</w:t>
-      </w:r>
-      <w:proofErr w:type="spellEnd"/>
-      <w:r>
-        <w:rPr>
-          <w:spacing w:val="-3"/>
-          <w:sz w:val="26"/>
-          <w:szCs w:val="26"/>
-          <w:lang w:val="en-US"/>
-        </w:rPr>
-        <w:t xml:space="preserve"> </w:t>
-      </w:r>
-      <w:proofErr w:type="spellStart"/>
-      <w:r>
-        <w:rPr>
-          <w:spacing w:val="-3"/>
-          <w:sz w:val="26"/>
-          <w:szCs w:val="26"/>
-          <w:lang w:val="en-US"/>
-        </w:rPr>
-        <w:t>nối</w:t>
-      </w:r>
-      <w:proofErr w:type="spellEnd"/>
-      <w:r>
-        <w:rPr>
-          <w:spacing w:val="-3"/>
-          <w:sz w:val="26"/>
-          <w:szCs w:val="26"/>
-          <w:lang w:val="en-US"/>
-        </w:rPr>
-        <w:t xml:space="preserve"> </w:t>
-      </w:r>
-      <w:proofErr w:type="spellStart"/>
-      <w:r>
-        <w:rPr>
-          <w:spacing w:val="-3"/>
-          <w:sz w:val="26"/>
-          <w:szCs w:val="26"/>
-          <w:lang w:val="en-US"/>
-        </w:rPr>
-        <w:t>cơ</w:t>
-      </w:r>
-      <w:proofErr w:type="spellEnd"/>
-      <w:r>
-        <w:rPr>
-          <w:spacing w:val="-3"/>
-          <w:sz w:val="26"/>
-          <w:szCs w:val="26"/>
-          <w:lang w:val="en-US"/>
-        </w:rPr>
-        <w:t xml:space="preserve"> </w:t>
-      </w:r>
-      <w:proofErr w:type="spellStart"/>
-      <w:r>
-        <w:rPr>
-          <w:spacing w:val="-3"/>
-          <w:sz w:val="26"/>
-          <w:szCs w:val="26"/>
-          <w:lang w:val="en-US"/>
-        </w:rPr>
-        <w:t>sở</w:t>
-      </w:r>
-      <w:proofErr w:type="spellEnd"/>
-      <w:r>
-        <w:rPr>
-          <w:spacing w:val="-3"/>
-          <w:sz w:val="26"/>
-          <w:szCs w:val="26"/>
-          <w:lang w:val="en-US"/>
-        </w:rPr>
-        <w:t xml:space="preserve"> </w:t>
-      </w:r>
-      <w:proofErr w:type="spellStart"/>
-      <w:r>
-        <w:rPr>
-          <w:spacing w:val="-3"/>
-          <w:sz w:val="26"/>
-          <w:szCs w:val="26"/>
-          <w:lang w:val="en-US"/>
-        </w:rPr>
-        <w:t>dữ</w:t>
-      </w:r>
-      <w:proofErr w:type="spellEnd"/>
-      <w:r>
-        <w:rPr>
-          <w:spacing w:val="-3"/>
-          <w:sz w:val="26"/>
-          <w:szCs w:val="26"/>
-          <w:lang w:val="en-US"/>
-        </w:rPr>
-        <w:t xml:space="preserve"> </w:t>
-      </w:r>
-      <w:proofErr w:type="spellStart"/>
-      <w:r>
-        <w:rPr>
-          <w:spacing w:val="-3"/>
-          <w:sz w:val="26"/>
-          <w:szCs w:val="26"/>
-          <w:lang w:val="en-US"/>
-        </w:rPr>
-        <w:t>liệu</w:t>
-      </w:r>
-      <w:proofErr w:type="spellEnd"/>
+          <w:lang w:val="vi-VN"/>
+        </w:rPr>
+        <w:t>Kết nối cơ sở dữ liệu</w:t>
+      </w:r>
     </w:p>
     <w:p>
       <w:pPr>
@@ -21013,16 +20914,7 @@
           <w:sz w:val="24"/>
           <w:lang w:val="en-US"/>
         </w:rPr>
-        <w:t xml:space="preserve"> </w:t>
-      </w:r>
-      <w:r>
-        <w:rPr>
-          <w:b/>
-          <w:bCs/>
-          <w:sz w:val="24"/>
-          <w:lang w:val="en-US"/>
-        </w:rPr>
-        <w:t xml:space="preserve"> Danh </w:t>
+        <w:t xml:space="preserve">  Danh </w:t>
       </w:r>
       <w:proofErr w:type="spellStart"/>
       <w:r>
@@ -21648,7 +21540,6 @@
       <w:r>
         <w:rPr>
           <w:sz w:val="24"/>
-          <w:lang w:val="en-US"/>
         </w:rPr>
         <w:t xml:space="preserve">       </w:t>
       </w:r>
@@ -21744,7 +21635,6 @@
         <w:t xml:space="preserve"> </w:t>
       </w:r>
       <w:proofErr w:type="spellStart"/>
-      <w:proofErr w:type="gramStart"/>
       <w:r>
         <w:rPr>
           <w:sz w:val="26"/>
@@ -21763,7 +21653,6 @@
         <w:t>(</w:t>
       </w:r>
       <w:proofErr w:type="spellStart"/>
-      <w:proofErr w:type="gramEnd"/>
       <w:r>
         <w:rPr>
           <w:sz w:val="26"/>
@@ -21877,7 +21766,6 @@
         <w:t>v_ThongTinNhanVien</w:t>
       </w:r>
       <w:proofErr w:type="spellEnd"/>
-      <w:proofErr w:type="gramStart"/>
       <w:r>
         <w:rPr>
           <w:sz w:val="26"/>
@@ -21886,7 +21774,6 @@
         </w:rPr>
         <w:t>";</w:t>
       </w:r>
-      <w:proofErr w:type="gramEnd"/>
     </w:p>
     <w:p>
       <w:pPr>
@@ -21913,7 +21800,6 @@
         <w:t xml:space="preserve">return </w:t>
       </w:r>
       <w:proofErr w:type="spellStart"/>
-      <w:proofErr w:type="gramStart"/>
       <w:r>
         <w:rPr>
           <w:sz w:val="26"/>
@@ -21932,7 +21818,6 @@
         <w:t>(</w:t>
       </w:r>
       <w:proofErr w:type="spellStart"/>
-      <w:proofErr w:type="gramEnd"/>
       <w:r>
         <w:rPr>
           <w:sz w:val="26"/>
@@ -22564,24 +22449,13 @@
           <w:szCs w:val="26"/>
         </w:rPr>
       </w:pPr>
-    </w:p>
-    <w:p>
-      <w:pPr>
-        <w:widowControl/>
-        <w:adjustRightInd w:val="0"/>
-        <w:ind w:left="460"/>
-        <w:rPr>
-          <w:rFonts w:eastAsiaTheme="minorHAnsi"/>
-          <w:sz w:val="26"/>
-          <w:szCs w:val="26"/>
-        </w:rPr>
-      </w:pPr>
-      <w:r>
-        <w:rPr>
-          <w:rFonts w:eastAsiaTheme="minorHAnsi"/>
-          <w:sz w:val="26"/>
-          <w:szCs w:val="26"/>
-        </w:rPr>
+      <w:r>
+        <w:rPr>
+          <w:rFonts w:eastAsiaTheme="minorHAnsi"/>
+          <w:sz w:val="26"/>
+          <w:szCs w:val="26"/>
+        </w:rPr>
+        <w:lastRenderedPageBreak/>
         <w:t>Thực thi trên C#:</w:t>
       </w:r>
     </w:p>
@@ -22759,19 +22633,6 @@
     </w:p>
     <w:p>
       <w:pPr>
-        <w:widowControl/>
-        <w:adjustRightInd w:val="0"/>
-        <w:ind w:left="460"/>
-        <w:rPr>
-          <w:rFonts w:eastAsiaTheme="minorHAnsi"/>
-          <w:color w:val="000000"/>
-          <w:sz w:val="26"/>
-          <w:szCs w:val="26"/>
-        </w:rPr>
-      </w:pPr>
-    </w:p>
-    <w:p>
-      <w:pPr>
         <w:pStyle w:val="ListParagraph"/>
         <w:numPr>
           <w:ilvl w:val="1"/>
@@ -23184,11 +23045,2869 @@
     <w:p>
       <w:pPr>
         <w:pStyle w:val="ListParagraph"/>
+        <w:numPr>
+          <w:ilvl w:val="1"/>
+          <w:numId w:val="20"/>
+        </w:numPr>
         <w:spacing w:before="209"/>
-        <w:ind w:left="820" w:firstLine="0"/>
+        <w:rPr>
+          <w:b/>
+          <w:bCs/>
+          <w:sz w:val="26"/>
+          <w:szCs w:val="26"/>
+        </w:rPr>
+      </w:pPr>
+      <w:r>
+        <w:rPr>
+          <w:b/>
+          <w:bCs/>
+          <w:sz w:val="26"/>
+          <w:szCs w:val="26"/>
+        </w:rPr>
+        <w:t xml:space="preserve">Danh mục </w:t>
+      </w:r>
+      <w:r>
+        <w:rPr>
+          <w:b/>
+          <w:bCs/>
+          <w:sz w:val="26"/>
+          <w:szCs w:val="26"/>
+        </w:rPr>
+        <w:t>phiếu thu (đơn nhập)</w:t>
+      </w:r>
+      <w:r>
+        <w:rPr>
+          <w:b/>
+          <w:bCs/>
+          <w:sz w:val="26"/>
+          <w:szCs w:val="26"/>
+        </w:rPr>
+        <w:t>:</w:t>
+      </w:r>
+    </w:p>
+    <w:p>
+      <w:pPr>
+        <w:widowControl/>
+        <w:adjustRightInd w:val="0"/>
+        <w:ind w:left="460"/>
+        <w:rPr>
+          <w:rFonts w:eastAsiaTheme="minorHAnsi"/>
+          <w:color w:val="000000"/>
+          <w:sz w:val="26"/>
+          <w:szCs w:val="26"/>
+          <w:lang w:val="en-US"/>
+        </w:rPr>
+      </w:pPr>
+    </w:p>
+    <w:p>
+      <w:pPr>
+        <w:widowControl/>
+        <w:pBdr>
+          <w:top w:val="single" w:sz="4" w:space="1" w:color="auto"/>
+          <w:left w:val="single" w:sz="4" w:space="4" w:color="auto"/>
+          <w:bottom w:val="single" w:sz="4" w:space="1" w:color="auto"/>
+          <w:right w:val="single" w:sz="4" w:space="4" w:color="auto"/>
+        </w:pBdr>
+        <w:adjustRightInd w:val="0"/>
+        <w:ind w:left="460"/>
+        <w:rPr>
+          <w:rFonts w:eastAsiaTheme="minorHAnsi"/>
+          <w:color w:val="000000"/>
+          <w:sz w:val="26"/>
+          <w:szCs w:val="26"/>
+        </w:rPr>
+      </w:pPr>
+      <w:r>
+        <w:rPr>
+          <w:rFonts w:eastAsiaTheme="minorHAnsi"/>
+          <w:color w:val="000000"/>
+          <w:sz w:val="26"/>
+          <w:szCs w:val="26"/>
+        </w:rPr>
+        <w:t xml:space="preserve">CREATE VIEW </w:t>
+      </w:r>
+      <w:proofErr w:type="spellStart"/>
+      <w:r>
+        <w:rPr>
+          <w:rFonts w:eastAsiaTheme="minorHAnsi"/>
+          <w:color w:val="000000"/>
+          <w:sz w:val="26"/>
+          <w:szCs w:val="26"/>
+        </w:rPr>
+        <w:t>v_ChiTietDonNhap</w:t>
+      </w:r>
+      <w:proofErr w:type="spellEnd"/>
+      <w:r>
+        <w:rPr>
+          <w:rFonts w:eastAsiaTheme="minorHAnsi"/>
+          <w:color w:val="000000"/>
+          <w:sz w:val="26"/>
+          <w:szCs w:val="26"/>
+        </w:rPr>
+        <w:t xml:space="preserve"> AS</w:t>
+      </w:r>
+    </w:p>
+    <w:p>
+      <w:pPr>
+        <w:widowControl/>
+        <w:pBdr>
+          <w:top w:val="single" w:sz="4" w:space="1" w:color="auto"/>
+          <w:left w:val="single" w:sz="4" w:space="4" w:color="auto"/>
+          <w:bottom w:val="single" w:sz="4" w:space="1" w:color="auto"/>
+          <w:right w:val="single" w:sz="4" w:space="4" w:color="auto"/>
+        </w:pBdr>
+        <w:adjustRightInd w:val="0"/>
+        <w:ind w:left="460"/>
+        <w:rPr>
+          <w:rFonts w:eastAsiaTheme="minorHAnsi"/>
+          <w:color w:val="000000"/>
+          <w:sz w:val="26"/>
+          <w:szCs w:val="26"/>
+        </w:rPr>
+      </w:pPr>
+      <w:r>
+        <w:rPr>
+          <w:rFonts w:eastAsiaTheme="minorHAnsi"/>
+          <w:color w:val="000000"/>
+          <w:sz w:val="26"/>
+          <w:szCs w:val="26"/>
+        </w:rPr>
+        <w:t xml:space="preserve">SELECT </w:t>
+      </w:r>
+      <w:proofErr w:type="spellStart"/>
+      <w:r>
+        <w:rPr>
+          <w:rFonts w:eastAsiaTheme="minorHAnsi"/>
+          <w:color w:val="000000"/>
+          <w:sz w:val="26"/>
+          <w:szCs w:val="26"/>
+        </w:rPr>
+        <w:t>dn.MaDonNhap</w:t>
+      </w:r>
+      <w:proofErr w:type="spellEnd"/>
+      <w:r>
+        <w:rPr>
+          <w:rFonts w:eastAsiaTheme="minorHAnsi"/>
+          <w:color w:val="000000"/>
+          <w:sz w:val="26"/>
+          <w:szCs w:val="26"/>
+        </w:rPr>
+        <w:t xml:space="preserve">, </w:t>
+      </w:r>
+      <w:proofErr w:type="spellStart"/>
+      <w:r>
+        <w:rPr>
+          <w:rFonts w:eastAsiaTheme="minorHAnsi"/>
+          <w:color w:val="000000"/>
+          <w:sz w:val="26"/>
+          <w:szCs w:val="26"/>
+        </w:rPr>
+        <w:t>ctdn.MaSPham</w:t>
+      </w:r>
+      <w:proofErr w:type="spellEnd"/>
+      <w:r>
+        <w:rPr>
+          <w:rFonts w:eastAsiaTheme="minorHAnsi"/>
+          <w:color w:val="000000"/>
+          <w:sz w:val="26"/>
+          <w:szCs w:val="26"/>
+        </w:rPr>
+        <w:t xml:space="preserve">, </w:t>
+      </w:r>
+      <w:proofErr w:type="spellStart"/>
+      <w:r>
+        <w:rPr>
+          <w:rFonts w:eastAsiaTheme="minorHAnsi"/>
+          <w:color w:val="000000"/>
+          <w:sz w:val="26"/>
+          <w:szCs w:val="26"/>
+        </w:rPr>
+        <w:t>ctdn.SoLuongNhap</w:t>
+      </w:r>
+      <w:proofErr w:type="spellEnd"/>
+      <w:r>
+        <w:rPr>
+          <w:rFonts w:eastAsiaTheme="minorHAnsi"/>
+          <w:color w:val="000000"/>
+          <w:sz w:val="26"/>
+          <w:szCs w:val="26"/>
+        </w:rPr>
+        <w:t xml:space="preserve">, </w:t>
+      </w:r>
+      <w:proofErr w:type="spellStart"/>
+      <w:r>
+        <w:rPr>
+          <w:rFonts w:eastAsiaTheme="minorHAnsi"/>
+          <w:color w:val="000000"/>
+          <w:sz w:val="26"/>
+          <w:szCs w:val="26"/>
+        </w:rPr>
+        <w:t>ctdn.GiaNhap</w:t>
+      </w:r>
+      <w:proofErr w:type="spellEnd"/>
+      <w:r>
+        <w:rPr>
+          <w:rFonts w:eastAsiaTheme="minorHAnsi"/>
+          <w:color w:val="000000"/>
+          <w:sz w:val="26"/>
+          <w:szCs w:val="26"/>
+        </w:rPr>
+        <w:t xml:space="preserve">, </w:t>
+      </w:r>
+      <w:proofErr w:type="spellStart"/>
+      <w:r>
+        <w:rPr>
+          <w:rFonts w:eastAsiaTheme="minorHAnsi"/>
+          <w:color w:val="000000"/>
+          <w:sz w:val="26"/>
+          <w:szCs w:val="26"/>
+        </w:rPr>
+        <w:t>sp.TenSPham</w:t>
+      </w:r>
+      <w:proofErr w:type="spellEnd"/>
+      <w:r>
+        <w:rPr>
+          <w:rFonts w:eastAsiaTheme="minorHAnsi"/>
+          <w:color w:val="000000"/>
+          <w:sz w:val="26"/>
+          <w:szCs w:val="26"/>
+        </w:rPr>
+        <w:t xml:space="preserve">, </w:t>
+      </w:r>
+      <w:proofErr w:type="spellStart"/>
+      <w:r>
+        <w:rPr>
+          <w:rFonts w:eastAsiaTheme="minorHAnsi"/>
+          <w:color w:val="000000"/>
+          <w:sz w:val="26"/>
+          <w:szCs w:val="26"/>
+        </w:rPr>
+        <w:t>dn.NgNhap</w:t>
+      </w:r>
+      <w:proofErr w:type="spellEnd"/>
+    </w:p>
+    <w:p>
+      <w:pPr>
+        <w:widowControl/>
+        <w:pBdr>
+          <w:top w:val="single" w:sz="4" w:space="1" w:color="auto"/>
+          <w:left w:val="single" w:sz="4" w:space="4" w:color="auto"/>
+          <w:bottom w:val="single" w:sz="4" w:space="1" w:color="auto"/>
+          <w:right w:val="single" w:sz="4" w:space="4" w:color="auto"/>
+        </w:pBdr>
+        <w:adjustRightInd w:val="0"/>
+        <w:ind w:left="460"/>
+        <w:rPr>
+          <w:rFonts w:eastAsiaTheme="minorHAnsi"/>
+          <w:color w:val="000000"/>
+          <w:sz w:val="26"/>
+          <w:szCs w:val="26"/>
+        </w:rPr>
+      </w:pPr>
+      <w:r>
+        <w:rPr>
+          <w:rFonts w:eastAsiaTheme="minorHAnsi"/>
+          <w:color w:val="000000"/>
+          <w:sz w:val="26"/>
+          <w:szCs w:val="26"/>
+        </w:rPr>
+        <w:t xml:space="preserve">FROM CHITIETDONNHAP </w:t>
+      </w:r>
+      <w:proofErr w:type="spellStart"/>
+      <w:r>
+        <w:rPr>
+          <w:rFonts w:eastAsiaTheme="minorHAnsi"/>
+          <w:color w:val="000000"/>
+          <w:sz w:val="26"/>
+          <w:szCs w:val="26"/>
+        </w:rPr>
+        <w:t>ctdn</w:t>
+      </w:r>
+      <w:proofErr w:type="spellEnd"/>
+      <w:r>
+        <w:rPr>
+          <w:rFonts w:eastAsiaTheme="minorHAnsi"/>
+          <w:color w:val="000000"/>
+          <w:sz w:val="26"/>
+          <w:szCs w:val="26"/>
+        </w:rPr>
+        <w:t xml:space="preserve"> INNER JOIN</w:t>
+      </w:r>
+    </w:p>
+    <w:p>
+      <w:pPr>
+        <w:widowControl/>
+        <w:pBdr>
+          <w:top w:val="single" w:sz="4" w:space="1" w:color="auto"/>
+          <w:left w:val="single" w:sz="4" w:space="4" w:color="auto"/>
+          <w:bottom w:val="single" w:sz="4" w:space="1" w:color="auto"/>
+          <w:right w:val="single" w:sz="4" w:space="4" w:color="auto"/>
+        </w:pBdr>
+        <w:adjustRightInd w:val="0"/>
+        <w:ind w:left="460"/>
+        <w:rPr>
+          <w:rFonts w:eastAsiaTheme="minorHAnsi"/>
+          <w:color w:val="000000"/>
+          <w:sz w:val="26"/>
+          <w:szCs w:val="26"/>
+        </w:rPr>
+      </w:pPr>
+      <w:r>
+        <w:rPr>
+          <w:rFonts w:eastAsiaTheme="minorHAnsi"/>
+          <w:color w:val="000000"/>
+          <w:sz w:val="26"/>
+          <w:szCs w:val="26"/>
+        </w:rPr>
+        <w:t xml:space="preserve">     DONNHAP </w:t>
+      </w:r>
+      <w:proofErr w:type="spellStart"/>
+      <w:r>
+        <w:rPr>
+          <w:rFonts w:eastAsiaTheme="minorHAnsi"/>
+          <w:color w:val="000000"/>
+          <w:sz w:val="26"/>
+          <w:szCs w:val="26"/>
+        </w:rPr>
+        <w:t>dn</w:t>
+      </w:r>
+      <w:proofErr w:type="spellEnd"/>
+      <w:r>
+        <w:rPr>
+          <w:rFonts w:eastAsiaTheme="minorHAnsi"/>
+          <w:color w:val="000000"/>
+          <w:sz w:val="26"/>
+          <w:szCs w:val="26"/>
+        </w:rPr>
+        <w:t xml:space="preserve"> ON </w:t>
+      </w:r>
+      <w:proofErr w:type="spellStart"/>
+      <w:r>
+        <w:rPr>
+          <w:rFonts w:eastAsiaTheme="minorHAnsi"/>
+          <w:color w:val="000000"/>
+          <w:sz w:val="26"/>
+          <w:szCs w:val="26"/>
+        </w:rPr>
+        <w:t>ctdn.MaDonNhap</w:t>
+      </w:r>
+      <w:proofErr w:type="spellEnd"/>
+      <w:r>
+        <w:rPr>
+          <w:rFonts w:eastAsiaTheme="minorHAnsi"/>
+          <w:color w:val="000000"/>
+          <w:sz w:val="26"/>
+          <w:szCs w:val="26"/>
+        </w:rPr>
+        <w:t xml:space="preserve"> = </w:t>
+      </w:r>
+      <w:proofErr w:type="spellStart"/>
+      <w:r>
+        <w:rPr>
+          <w:rFonts w:eastAsiaTheme="minorHAnsi"/>
+          <w:color w:val="000000"/>
+          <w:sz w:val="26"/>
+          <w:szCs w:val="26"/>
+        </w:rPr>
+        <w:t>dn.MaDonNhap</w:t>
+      </w:r>
+      <w:proofErr w:type="spellEnd"/>
+      <w:r>
+        <w:rPr>
+          <w:rFonts w:eastAsiaTheme="minorHAnsi"/>
+          <w:color w:val="000000"/>
+          <w:sz w:val="26"/>
+          <w:szCs w:val="26"/>
+        </w:rPr>
+        <w:t xml:space="preserve"> INNER JOIN</w:t>
+      </w:r>
+    </w:p>
+    <w:p>
+      <w:pPr>
+        <w:widowControl/>
+        <w:pBdr>
+          <w:top w:val="single" w:sz="4" w:space="1" w:color="auto"/>
+          <w:left w:val="single" w:sz="4" w:space="4" w:color="auto"/>
+          <w:bottom w:val="single" w:sz="4" w:space="1" w:color="auto"/>
+          <w:right w:val="single" w:sz="4" w:space="4" w:color="auto"/>
+        </w:pBdr>
+        <w:adjustRightInd w:val="0"/>
+        <w:ind w:left="460"/>
+        <w:rPr>
+          <w:rFonts w:eastAsiaTheme="minorHAnsi"/>
+          <w:color w:val="000000"/>
+          <w:sz w:val="26"/>
+          <w:szCs w:val="26"/>
+          <w:lang w:val="en-US"/>
+        </w:rPr>
+      </w:pPr>
+      <w:r>
+        <w:rPr>
+          <w:rFonts w:eastAsiaTheme="minorHAnsi"/>
+          <w:color w:val="000000"/>
+          <w:sz w:val="26"/>
+          <w:szCs w:val="26"/>
+        </w:rPr>
+        <w:t xml:space="preserve">     SANPHAM </w:t>
+      </w:r>
+      <w:proofErr w:type="spellStart"/>
+      <w:r>
+        <w:rPr>
+          <w:rFonts w:eastAsiaTheme="minorHAnsi"/>
+          <w:color w:val="000000"/>
+          <w:sz w:val="26"/>
+          <w:szCs w:val="26"/>
+        </w:rPr>
+        <w:t>sp</w:t>
+      </w:r>
+      <w:proofErr w:type="spellEnd"/>
+      <w:r>
+        <w:rPr>
+          <w:rFonts w:eastAsiaTheme="minorHAnsi"/>
+          <w:color w:val="000000"/>
+          <w:sz w:val="26"/>
+          <w:szCs w:val="26"/>
+        </w:rPr>
+        <w:t xml:space="preserve"> ON </w:t>
+      </w:r>
+      <w:proofErr w:type="spellStart"/>
+      <w:r>
+        <w:rPr>
+          <w:rFonts w:eastAsiaTheme="minorHAnsi"/>
+          <w:color w:val="000000"/>
+          <w:sz w:val="26"/>
+          <w:szCs w:val="26"/>
+        </w:rPr>
+        <w:t>ctdn.MaSPham</w:t>
+      </w:r>
+      <w:proofErr w:type="spellEnd"/>
+      <w:r>
+        <w:rPr>
+          <w:rFonts w:eastAsiaTheme="minorHAnsi"/>
+          <w:color w:val="000000"/>
+          <w:sz w:val="26"/>
+          <w:szCs w:val="26"/>
+        </w:rPr>
+        <w:t xml:space="preserve"> = </w:t>
+      </w:r>
+      <w:proofErr w:type="spellStart"/>
+      <w:r>
+        <w:rPr>
+          <w:rFonts w:eastAsiaTheme="minorHAnsi"/>
+          <w:color w:val="000000"/>
+          <w:sz w:val="26"/>
+          <w:szCs w:val="26"/>
+        </w:rPr>
+        <w:t>sp.MaSPham</w:t>
+      </w:r>
+      <w:proofErr w:type="spellEnd"/>
+    </w:p>
+    <w:p>
+      <w:pPr>
+        <w:widowControl/>
+        <w:adjustRightInd w:val="0"/>
+        <w:ind w:left="460"/>
+        <w:rPr>
+          <w:rFonts w:eastAsiaTheme="minorHAnsi"/>
+          <w:color w:val="000000"/>
+          <w:sz w:val="26"/>
+          <w:szCs w:val="26"/>
+          <w:lang w:val="en-US"/>
+        </w:rPr>
+      </w:pPr>
+    </w:p>
+    <w:p>
+      <w:pPr>
+        <w:widowControl/>
+        <w:adjustRightInd w:val="0"/>
+        <w:ind w:left="460"/>
+        <w:rPr>
+          <w:rFonts w:eastAsiaTheme="minorHAnsi"/>
+          <w:color w:val="000000"/>
+          <w:sz w:val="26"/>
+          <w:szCs w:val="26"/>
+          <w:lang w:val="en-US"/>
+        </w:rPr>
+      </w:pPr>
+      <w:proofErr w:type="spellStart"/>
+      <w:r>
+        <w:rPr>
+          <w:rFonts w:eastAsiaTheme="minorHAnsi"/>
+          <w:color w:val="000000"/>
+          <w:sz w:val="26"/>
+          <w:szCs w:val="26"/>
+          <w:lang w:val="en-US"/>
+        </w:rPr>
+        <w:t>Thực</w:t>
+      </w:r>
+      <w:proofErr w:type="spellEnd"/>
+      <w:r>
+        <w:rPr>
+          <w:rFonts w:eastAsiaTheme="minorHAnsi"/>
+          <w:color w:val="000000"/>
+          <w:sz w:val="26"/>
+          <w:szCs w:val="26"/>
+          <w:lang w:val="en-US"/>
+        </w:rPr>
+        <w:t xml:space="preserve"> </w:t>
+      </w:r>
+      <w:proofErr w:type="spellStart"/>
+      <w:r>
+        <w:rPr>
+          <w:rFonts w:eastAsiaTheme="minorHAnsi"/>
+          <w:color w:val="000000"/>
+          <w:sz w:val="26"/>
+          <w:szCs w:val="26"/>
+          <w:lang w:val="en-US"/>
+        </w:rPr>
+        <w:t>thi</w:t>
+      </w:r>
+      <w:proofErr w:type="spellEnd"/>
+      <w:r>
+        <w:rPr>
+          <w:rFonts w:eastAsiaTheme="minorHAnsi"/>
+          <w:color w:val="000000"/>
+          <w:sz w:val="26"/>
+          <w:szCs w:val="26"/>
+          <w:lang w:val="en-US"/>
+        </w:rPr>
+        <w:t xml:space="preserve"> </w:t>
+      </w:r>
+      <w:proofErr w:type="spellStart"/>
+      <w:r>
+        <w:rPr>
+          <w:rFonts w:eastAsiaTheme="minorHAnsi"/>
+          <w:color w:val="000000"/>
+          <w:sz w:val="26"/>
+          <w:szCs w:val="26"/>
+          <w:lang w:val="en-US"/>
+        </w:rPr>
+        <w:t>trên</w:t>
+      </w:r>
+      <w:proofErr w:type="spellEnd"/>
+      <w:r>
+        <w:rPr>
+          <w:rFonts w:eastAsiaTheme="minorHAnsi"/>
+          <w:color w:val="000000"/>
+          <w:sz w:val="26"/>
+          <w:szCs w:val="26"/>
+          <w:lang w:val="en-US"/>
+        </w:rPr>
+        <w:t xml:space="preserve"> C#:</w:t>
+      </w:r>
+    </w:p>
+    <w:p>
+      <w:pPr>
+        <w:widowControl/>
+        <w:adjustRightInd w:val="0"/>
+        <w:ind w:left="460"/>
+        <w:rPr>
+          <w:rFonts w:eastAsiaTheme="minorHAnsi"/>
+          <w:color w:val="000000"/>
+          <w:sz w:val="26"/>
+          <w:szCs w:val="26"/>
+          <w:lang w:val="en-US"/>
+        </w:rPr>
+      </w:pPr>
+    </w:p>
+    <w:p>
+      <w:pPr>
+        <w:widowControl/>
+        <w:pBdr>
+          <w:top w:val="single" w:sz="4" w:space="1" w:color="auto"/>
+          <w:left w:val="single" w:sz="4" w:space="4" w:color="auto"/>
+          <w:bottom w:val="single" w:sz="4" w:space="1" w:color="auto"/>
+          <w:right w:val="single" w:sz="4" w:space="4" w:color="auto"/>
+        </w:pBdr>
+        <w:adjustRightInd w:val="0"/>
+        <w:ind w:left="460"/>
+        <w:rPr>
+          <w:rFonts w:eastAsiaTheme="minorHAnsi"/>
+          <w:color w:val="000000"/>
+          <w:sz w:val="26"/>
+          <w:szCs w:val="26"/>
+          <w:lang w:val="en-US"/>
+        </w:rPr>
+      </w:pPr>
+      <w:r>
+        <w:rPr>
+          <w:rFonts w:eastAsiaTheme="minorHAnsi"/>
+          <w:color w:val="000000"/>
+          <w:sz w:val="26"/>
+          <w:szCs w:val="26"/>
+          <w:lang w:val="en-US"/>
+        </w:rPr>
+        <w:t xml:space="preserve">public static </w:t>
+      </w:r>
+      <w:proofErr w:type="spellStart"/>
+      <w:r>
+        <w:rPr>
+          <w:rFonts w:eastAsiaTheme="minorHAnsi"/>
+          <w:color w:val="000000"/>
+          <w:sz w:val="26"/>
+          <w:szCs w:val="26"/>
+          <w:lang w:val="en-US"/>
+        </w:rPr>
+        <w:t>DataTable</w:t>
+      </w:r>
+      <w:proofErr w:type="spellEnd"/>
+      <w:r>
+        <w:rPr>
+          <w:rFonts w:eastAsiaTheme="minorHAnsi"/>
+          <w:color w:val="000000"/>
+          <w:sz w:val="26"/>
+          <w:szCs w:val="26"/>
+          <w:lang w:val="en-US"/>
+        </w:rPr>
+        <w:t xml:space="preserve"> </w:t>
+      </w:r>
+      <w:proofErr w:type="spellStart"/>
+      <w:r>
+        <w:rPr>
+          <w:rFonts w:eastAsiaTheme="minorHAnsi"/>
+          <w:color w:val="000000"/>
+          <w:sz w:val="26"/>
+          <w:szCs w:val="26"/>
+          <w:lang w:val="en-US"/>
+        </w:rPr>
+        <w:t>stockReceipts</w:t>
+      </w:r>
+      <w:proofErr w:type="spellEnd"/>
+      <w:r>
+        <w:rPr>
+          <w:rFonts w:eastAsiaTheme="minorHAnsi"/>
+          <w:color w:val="000000"/>
+          <w:sz w:val="26"/>
+          <w:szCs w:val="26"/>
+          <w:lang w:val="en-US"/>
+        </w:rPr>
+        <w:t>(</w:t>
+      </w:r>
+      <w:proofErr w:type="spellStart"/>
+      <w:r>
+        <w:rPr>
+          <w:rFonts w:eastAsiaTheme="minorHAnsi"/>
+          <w:color w:val="000000"/>
+          <w:sz w:val="26"/>
+          <w:szCs w:val="26"/>
+          <w:lang w:val="en-US"/>
+        </w:rPr>
+        <w:t>DBConn</w:t>
+      </w:r>
+      <w:proofErr w:type="spellEnd"/>
+      <w:r>
+        <w:rPr>
+          <w:rFonts w:eastAsiaTheme="minorHAnsi"/>
+          <w:color w:val="000000"/>
+          <w:sz w:val="26"/>
+          <w:szCs w:val="26"/>
+          <w:lang w:val="en-US"/>
+        </w:rPr>
+        <w:t xml:space="preserve"> </w:t>
+      </w:r>
+      <w:proofErr w:type="spellStart"/>
+      <w:r>
+        <w:rPr>
+          <w:rFonts w:eastAsiaTheme="minorHAnsi"/>
+          <w:color w:val="000000"/>
+          <w:sz w:val="26"/>
+          <w:szCs w:val="26"/>
+          <w:lang w:val="en-US"/>
+        </w:rPr>
+        <w:t>db</w:t>
+      </w:r>
+      <w:proofErr w:type="spellEnd"/>
+      <w:r>
+        <w:rPr>
+          <w:rFonts w:eastAsiaTheme="minorHAnsi"/>
+          <w:color w:val="000000"/>
+          <w:sz w:val="26"/>
+          <w:szCs w:val="26"/>
+          <w:lang w:val="en-US"/>
+        </w:rPr>
+        <w:t>)</w:t>
+      </w:r>
+    </w:p>
+    <w:p>
+      <w:pPr>
+        <w:widowControl/>
+        <w:pBdr>
+          <w:top w:val="single" w:sz="4" w:space="1" w:color="auto"/>
+          <w:left w:val="single" w:sz="4" w:space="4" w:color="auto"/>
+          <w:bottom w:val="single" w:sz="4" w:space="1" w:color="auto"/>
+          <w:right w:val="single" w:sz="4" w:space="4" w:color="auto"/>
+        </w:pBdr>
+        <w:adjustRightInd w:val="0"/>
+        <w:ind w:left="460"/>
+        <w:rPr>
+          <w:rFonts w:eastAsiaTheme="minorHAnsi"/>
+          <w:color w:val="000000"/>
+          <w:sz w:val="26"/>
+          <w:szCs w:val="26"/>
+          <w:lang w:val="en-US"/>
+        </w:rPr>
+      </w:pPr>
+      <w:r>
+        <w:rPr>
+          <w:rFonts w:eastAsiaTheme="minorHAnsi"/>
+          <w:color w:val="000000"/>
+          <w:sz w:val="26"/>
+          <w:szCs w:val="26"/>
+          <w:lang w:val="en-US"/>
+        </w:rPr>
+        <w:t>{</w:t>
+      </w:r>
+    </w:p>
+    <w:p>
+      <w:pPr>
+        <w:widowControl/>
+        <w:pBdr>
+          <w:top w:val="single" w:sz="4" w:space="1" w:color="auto"/>
+          <w:left w:val="single" w:sz="4" w:space="4" w:color="auto"/>
+          <w:bottom w:val="single" w:sz="4" w:space="1" w:color="auto"/>
+          <w:right w:val="single" w:sz="4" w:space="4" w:color="auto"/>
+        </w:pBdr>
+        <w:adjustRightInd w:val="0"/>
+        <w:ind w:left="460"/>
+        <w:rPr>
+          <w:rFonts w:eastAsiaTheme="minorHAnsi"/>
+          <w:color w:val="000000"/>
+          <w:sz w:val="26"/>
+          <w:szCs w:val="26"/>
+          <w:lang w:val="en-US"/>
+        </w:rPr>
+      </w:pPr>
+      <w:r>
+        <w:rPr>
+          <w:rFonts w:eastAsiaTheme="minorHAnsi"/>
+          <w:color w:val="000000"/>
+          <w:sz w:val="26"/>
+          <w:szCs w:val="26"/>
+          <w:lang w:val="en-US"/>
+        </w:rPr>
+        <w:t xml:space="preserve">    string </w:t>
+      </w:r>
+      <w:proofErr w:type="spellStart"/>
+      <w:r>
+        <w:rPr>
+          <w:rFonts w:eastAsiaTheme="minorHAnsi"/>
+          <w:color w:val="000000"/>
+          <w:sz w:val="26"/>
+          <w:szCs w:val="26"/>
+          <w:lang w:val="en-US"/>
+        </w:rPr>
+        <w:t>sqlquery</w:t>
+      </w:r>
+      <w:proofErr w:type="spellEnd"/>
+      <w:r>
+        <w:rPr>
+          <w:rFonts w:eastAsiaTheme="minorHAnsi"/>
+          <w:color w:val="000000"/>
+          <w:sz w:val="26"/>
+          <w:szCs w:val="26"/>
+          <w:lang w:val="en-US"/>
+        </w:rPr>
+        <w:t xml:space="preserve"> = "SELECT * FROM </w:t>
+      </w:r>
+      <w:proofErr w:type="spellStart"/>
+      <w:r>
+        <w:rPr>
+          <w:rFonts w:eastAsiaTheme="minorHAnsi"/>
+          <w:color w:val="000000"/>
+          <w:sz w:val="26"/>
+          <w:szCs w:val="26"/>
+          <w:lang w:val="en-US"/>
+        </w:rPr>
+        <w:t>v_ChiTietDonNhap</w:t>
+      </w:r>
+      <w:proofErr w:type="spellEnd"/>
+      <w:r>
+        <w:rPr>
+          <w:rFonts w:eastAsiaTheme="minorHAnsi"/>
+          <w:color w:val="000000"/>
+          <w:sz w:val="26"/>
+          <w:szCs w:val="26"/>
+          <w:lang w:val="en-US"/>
+        </w:rPr>
+        <w:t>";</w:t>
+      </w:r>
+    </w:p>
+    <w:p>
+      <w:pPr>
+        <w:widowControl/>
+        <w:pBdr>
+          <w:top w:val="single" w:sz="4" w:space="1" w:color="auto"/>
+          <w:left w:val="single" w:sz="4" w:space="4" w:color="auto"/>
+          <w:bottom w:val="single" w:sz="4" w:space="1" w:color="auto"/>
+          <w:right w:val="single" w:sz="4" w:space="4" w:color="auto"/>
+        </w:pBdr>
+        <w:adjustRightInd w:val="0"/>
+        <w:ind w:left="460"/>
+        <w:rPr>
+          <w:rFonts w:eastAsiaTheme="minorHAnsi"/>
+          <w:color w:val="000000"/>
+          <w:sz w:val="26"/>
+          <w:szCs w:val="26"/>
+          <w:lang w:val="en-US"/>
+        </w:rPr>
+      </w:pPr>
+      <w:r>
+        <w:rPr>
+          <w:rFonts w:eastAsiaTheme="minorHAnsi"/>
+          <w:color w:val="000000"/>
+          <w:sz w:val="26"/>
+          <w:szCs w:val="26"/>
+          <w:lang w:val="en-US"/>
+        </w:rPr>
+        <w:t xml:space="preserve">    return </w:t>
+      </w:r>
+      <w:proofErr w:type="spellStart"/>
+      <w:r>
+        <w:rPr>
+          <w:rFonts w:eastAsiaTheme="minorHAnsi"/>
+          <w:color w:val="000000"/>
+          <w:sz w:val="26"/>
+          <w:szCs w:val="26"/>
+          <w:lang w:val="en-US"/>
+        </w:rPr>
+        <w:t>LoadTable</w:t>
+      </w:r>
+      <w:proofErr w:type="spellEnd"/>
+      <w:r>
+        <w:rPr>
+          <w:rFonts w:eastAsiaTheme="minorHAnsi"/>
+          <w:color w:val="000000"/>
+          <w:sz w:val="26"/>
+          <w:szCs w:val="26"/>
+          <w:lang w:val="en-US"/>
+        </w:rPr>
+        <w:t>(</w:t>
+      </w:r>
+      <w:proofErr w:type="spellStart"/>
+      <w:r>
+        <w:rPr>
+          <w:rFonts w:eastAsiaTheme="minorHAnsi"/>
+          <w:color w:val="000000"/>
+          <w:sz w:val="26"/>
+          <w:szCs w:val="26"/>
+          <w:lang w:val="en-US"/>
+        </w:rPr>
+        <w:t>db</w:t>
+      </w:r>
+      <w:proofErr w:type="spellEnd"/>
+      <w:r>
+        <w:rPr>
+          <w:rFonts w:eastAsiaTheme="minorHAnsi"/>
+          <w:color w:val="000000"/>
+          <w:sz w:val="26"/>
+          <w:szCs w:val="26"/>
+          <w:lang w:val="en-US"/>
+        </w:rPr>
+        <w:t xml:space="preserve">, </w:t>
+      </w:r>
+      <w:proofErr w:type="spellStart"/>
+      <w:r>
+        <w:rPr>
+          <w:rFonts w:eastAsiaTheme="minorHAnsi"/>
+          <w:color w:val="000000"/>
+          <w:sz w:val="26"/>
+          <w:szCs w:val="26"/>
+          <w:lang w:val="en-US"/>
+        </w:rPr>
+        <w:t>sqlquery</w:t>
+      </w:r>
+      <w:proofErr w:type="spellEnd"/>
+      <w:r>
+        <w:rPr>
+          <w:rFonts w:eastAsiaTheme="minorHAnsi"/>
+          <w:color w:val="000000"/>
+          <w:sz w:val="26"/>
+          <w:szCs w:val="26"/>
+          <w:lang w:val="en-US"/>
+        </w:rPr>
+        <w:t>);</w:t>
+      </w:r>
+    </w:p>
+    <w:p>
+      <w:pPr>
+        <w:widowControl/>
+        <w:pBdr>
+          <w:top w:val="single" w:sz="4" w:space="1" w:color="auto"/>
+          <w:left w:val="single" w:sz="4" w:space="4" w:color="auto"/>
+          <w:bottom w:val="single" w:sz="4" w:space="1" w:color="auto"/>
+          <w:right w:val="single" w:sz="4" w:space="4" w:color="auto"/>
+        </w:pBdr>
+        <w:adjustRightInd w:val="0"/>
+        <w:ind w:left="460"/>
+        <w:rPr>
+          <w:rFonts w:eastAsiaTheme="minorHAnsi"/>
+          <w:color w:val="000000"/>
+          <w:sz w:val="26"/>
+          <w:szCs w:val="26"/>
+          <w:lang w:val="en-US"/>
+        </w:rPr>
+      </w:pPr>
+      <w:r>
+        <w:rPr>
+          <w:rFonts w:eastAsiaTheme="minorHAnsi"/>
+          <w:color w:val="000000"/>
+          <w:sz w:val="26"/>
+          <w:szCs w:val="26"/>
+          <w:lang w:val="en-US"/>
+        </w:rPr>
+        <w:t>}</w:t>
+      </w:r>
+    </w:p>
+    <w:p>
+      <w:pPr>
+        <w:pStyle w:val="ListParagraph"/>
+        <w:numPr>
+          <w:ilvl w:val="1"/>
+          <w:numId w:val="20"/>
+        </w:numPr>
+        <w:spacing w:before="209"/>
+        <w:rPr>
+          <w:b/>
+          <w:bCs/>
+          <w:sz w:val="26"/>
+          <w:szCs w:val="26"/>
+        </w:rPr>
+      </w:pPr>
+      <w:bookmarkStart w:id="6" w:name="_Hlk180697280"/>
+      <w:r>
+        <w:rPr>
+          <w:b/>
+          <w:bCs/>
+          <w:sz w:val="26"/>
+          <w:szCs w:val="26"/>
+        </w:rPr>
+        <w:lastRenderedPageBreak/>
+        <w:t>Danh mục</w:t>
+      </w:r>
+      <w:r>
+        <w:rPr>
+          <w:b/>
+          <w:bCs/>
+          <w:sz w:val="26"/>
+          <w:szCs w:val="26"/>
+          <w:lang w:val="en-US"/>
+        </w:rPr>
+        <w:t xml:space="preserve"> </w:t>
+      </w:r>
+      <w:proofErr w:type="spellStart"/>
+      <w:r>
+        <w:rPr>
+          <w:b/>
+          <w:bCs/>
+          <w:sz w:val="26"/>
+          <w:szCs w:val="26"/>
+          <w:lang w:val="en-US"/>
+        </w:rPr>
+        <w:t>hóa</w:t>
+      </w:r>
+      <w:proofErr w:type="spellEnd"/>
+      <w:r>
+        <w:rPr>
+          <w:b/>
+          <w:bCs/>
+          <w:sz w:val="26"/>
+          <w:szCs w:val="26"/>
+          <w:lang w:val="en-US"/>
+        </w:rPr>
+        <w:t xml:space="preserve"> </w:t>
+      </w:r>
+      <w:proofErr w:type="spellStart"/>
+      <w:r>
+        <w:rPr>
+          <w:b/>
+          <w:bCs/>
+          <w:sz w:val="26"/>
+          <w:szCs w:val="26"/>
+          <w:lang w:val="en-US"/>
+        </w:rPr>
+        <w:t>đơn</w:t>
+      </w:r>
+      <w:proofErr w:type="spellEnd"/>
+      <w:r>
+        <w:rPr>
+          <w:b/>
+          <w:bCs/>
+          <w:sz w:val="26"/>
+          <w:szCs w:val="26"/>
+        </w:rPr>
+        <w:t>:</w:t>
+      </w:r>
+    </w:p>
+    <w:bookmarkEnd w:id="6"/>
+    <w:p>
+      <w:pPr>
+        <w:widowControl/>
+        <w:adjustRightInd w:val="0"/>
+        <w:ind w:left="460"/>
+        <w:rPr>
+          <w:rFonts w:eastAsiaTheme="minorHAnsi"/>
+          <w:color w:val="000000"/>
+          <w:sz w:val="26"/>
+          <w:szCs w:val="26"/>
+          <w:lang w:val="en-US"/>
+        </w:rPr>
+      </w:pPr>
+    </w:p>
+    <w:p>
+      <w:pPr>
+        <w:widowControl/>
+        <w:pBdr>
+          <w:top w:val="single" w:sz="4" w:space="1" w:color="auto"/>
+          <w:left w:val="single" w:sz="4" w:space="4" w:color="auto"/>
+          <w:bottom w:val="single" w:sz="4" w:space="1" w:color="auto"/>
+          <w:right w:val="single" w:sz="4" w:space="4" w:color="auto"/>
+        </w:pBdr>
+        <w:adjustRightInd w:val="0"/>
+        <w:ind w:left="460"/>
+        <w:rPr>
+          <w:rFonts w:eastAsiaTheme="minorHAnsi"/>
+          <w:color w:val="000000"/>
+          <w:sz w:val="26"/>
+          <w:szCs w:val="26"/>
+          <w:lang w:val="en-US"/>
+        </w:rPr>
+      </w:pPr>
+      <w:r>
+        <w:rPr>
+          <w:rFonts w:eastAsiaTheme="minorHAnsi"/>
+          <w:color w:val="0000FF"/>
+          <w:sz w:val="26"/>
+          <w:szCs w:val="26"/>
+          <w:lang w:val="en-US"/>
+        </w:rPr>
+        <w:t>CREATE</w:t>
+      </w:r>
+      <w:r>
+        <w:rPr>
+          <w:rFonts w:eastAsiaTheme="minorHAnsi"/>
+          <w:color w:val="000000"/>
+          <w:sz w:val="26"/>
+          <w:szCs w:val="26"/>
+          <w:lang w:val="en-US"/>
+        </w:rPr>
+        <w:t xml:space="preserve"> </w:t>
+      </w:r>
+      <w:r>
+        <w:rPr>
+          <w:rFonts w:eastAsiaTheme="minorHAnsi"/>
+          <w:color w:val="0000FF"/>
+          <w:sz w:val="26"/>
+          <w:szCs w:val="26"/>
+          <w:lang w:val="en-US"/>
+        </w:rPr>
+        <w:t>VIEW</w:t>
+      </w:r>
+      <w:r>
+        <w:rPr>
+          <w:rFonts w:eastAsiaTheme="minorHAnsi"/>
+          <w:color w:val="000000"/>
+          <w:sz w:val="26"/>
+          <w:szCs w:val="26"/>
+          <w:lang w:val="en-US"/>
+        </w:rPr>
+        <w:t xml:space="preserve"> [</w:t>
+      </w:r>
+      <w:proofErr w:type="spellStart"/>
+      <w:r>
+        <w:rPr>
+          <w:rFonts w:eastAsiaTheme="minorHAnsi"/>
+          <w:color w:val="000000"/>
+          <w:sz w:val="26"/>
+          <w:szCs w:val="26"/>
+          <w:lang w:val="en-US"/>
+        </w:rPr>
+        <w:t>dbo</w:t>
+      </w:r>
+      <w:proofErr w:type="spellEnd"/>
+      <w:r>
+        <w:rPr>
+          <w:rFonts w:eastAsiaTheme="minorHAnsi"/>
+          <w:color w:val="000000"/>
+          <w:sz w:val="26"/>
+          <w:szCs w:val="26"/>
+          <w:lang w:val="en-US"/>
+        </w:rPr>
+        <w:t>]</w:t>
+      </w:r>
+      <w:r>
+        <w:rPr>
+          <w:rFonts w:eastAsiaTheme="minorHAnsi"/>
+          <w:color w:val="808080"/>
+          <w:sz w:val="26"/>
+          <w:szCs w:val="26"/>
+          <w:lang w:val="en-US"/>
+        </w:rPr>
+        <w:t>.</w:t>
+      </w:r>
+      <w:r>
+        <w:rPr>
+          <w:rFonts w:eastAsiaTheme="minorHAnsi"/>
+          <w:color w:val="000000"/>
+          <w:sz w:val="26"/>
+          <w:szCs w:val="26"/>
+          <w:lang w:val="en-US"/>
+        </w:rPr>
+        <w:t>[</w:t>
+      </w:r>
+      <w:proofErr w:type="spellStart"/>
+      <w:r>
+        <w:rPr>
+          <w:rFonts w:eastAsiaTheme="minorHAnsi"/>
+          <w:color w:val="000000"/>
+          <w:sz w:val="26"/>
+          <w:szCs w:val="26"/>
+          <w:lang w:val="en-US"/>
+        </w:rPr>
+        <w:t>v_DanhMucHoaDon</w:t>
+      </w:r>
+      <w:proofErr w:type="spellEnd"/>
+      <w:r>
+        <w:rPr>
+          <w:rFonts w:eastAsiaTheme="minorHAnsi"/>
+          <w:color w:val="000000"/>
+          <w:sz w:val="26"/>
+          <w:szCs w:val="26"/>
+          <w:lang w:val="en-US"/>
+        </w:rPr>
+        <w:t xml:space="preserve">] </w:t>
+      </w:r>
+      <w:r>
+        <w:rPr>
+          <w:rFonts w:eastAsiaTheme="minorHAnsi"/>
+          <w:color w:val="0000FF"/>
+          <w:sz w:val="26"/>
+          <w:szCs w:val="26"/>
+          <w:lang w:val="en-US"/>
+        </w:rPr>
+        <w:t>AS</w:t>
+      </w:r>
+    </w:p>
+    <w:p>
+      <w:pPr>
+        <w:widowControl/>
+        <w:pBdr>
+          <w:top w:val="single" w:sz="4" w:space="1" w:color="auto"/>
+          <w:left w:val="single" w:sz="4" w:space="4" w:color="auto"/>
+          <w:bottom w:val="single" w:sz="4" w:space="1" w:color="auto"/>
+          <w:right w:val="single" w:sz="4" w:space="4" w:color="auto"/>
+        </w:pBdr>
+        <w:adjustRightInd w:val="0"/>
+        <w:ind w:left="460"/>
+        <w:rPr>
+          <w:rFonts w:eastAsiaTheme="minorHAnsi"/>
+          <w:color w:val="000000"/>
+          <w:sz w:val="26"/>
+          <w:szCs w:val="26"/>
+          <w:lang w:val="en-US"/>
+        </w:rPr>
+      </w:pPr>
+      <w:r>
+        <w:rPr>
+          <w:rFonts w:eastAsiaTheme="minorHAnsi"/>
+          <w:color w:val="0000FF"/>
+          <w:sz w:val="26"/>
+          <w:szCs w:val="26"/>
+          <w:lang w:val="en-US"/>
+        </w:rPr>
+        <w:t>SELECT</w:t>
+      </w:r>
+      <w:r>
+        <w:rPr>
+          <w:rFonts w:eastAsiaTheme="minorHAnsi"/>
+          <w:color w:val="000000"/>
+          <w:sz w:val="26"/>
+          <w:szCs w:val="26"/>
+          <w:lang w:val="en-US"/>
+        </w:rPr>
+        <w:t xml:space="preserve"> </w:t>
+      </w:r>
+      <w:proofErr w:type="spellStart"/>
+      <w:r>
+        <w:rPr>
+          <w:rFonts w:eastAsiaTheme="minorHAnsi"/>
+          <w:color w:val="000000"/>
+          <w:sz w:val="26"/>
+          <w:szCs w:val="26"/>
+          <w:lang w:val="en-US"/>
+        </w:rPr>
+        <w:t>hd</w:t>
+      </w:r>
+      <w:r>
+        <w:rPr>
+          <w:rFonts w:eastAsiaTheme="minorHAnsi"/>
+          <w:color w:val="808080"/>
+          <w:sz w:val="26"/>
+          <w:szCs w:val="26"/>
+          <w:lang w:val="en-US"/>
+        </w:rPr>
+        <w:t>.</w:t>
+      </w:r>
+      <w:r>
+        <w:rPr>
+          <w:rFonts w:eastAsiaTheme="minorHAnsi"/>
+          <w:color w:val="000000"/>
+          <w:sz w:val="26"/>
+          <w:szCs w:val="26"/>
+          <w:lang w:val="en-US"/>
+        </w:rPr>
+        <w:t>MaHoaDon</w:t>
+      </w:r>
+      <w:proofErr w:type="spellEnd"/>
+      <w:r>
+        <w:rPr>
+          <w:rFonts w:eastAsiaTheme="minorHAnsi"/>
+          <w:color w:val="808080"/>
+          <w:sz w:val="26"/>
+          <w:szCs w:val="26"/>
+          <w:lang w:val="en-US"/>
+        </w:rPr>
+        <w:t>,</w:t>
+      </w:r>
+      <w:r>
+        <w:rPr>
+          <w:rFonts w:eastAsiaTheme="minorHAnsi"/>
+          <w:color w:val="000000"/>
+          <w:sz w:val="26"/>
+          <w:szCs w:val="26"/>
+          <w:lang w:val="en-US"/>
+        </w:rPr>
+        <w:t xml:space="preserve"> </w:t>
+      </w:r>
+      <w:proofErr w:type="spellStart"/>
+      <w:r>
+        <w:rPr>
+          <w:rFonts w:eastAsiaTheme="minorHAnsi"/>
+          <w:color w:val="000000"/>
+          <w:sz w:val="26"/>
+          <w:szCs w:val="26"/>
+          <w:lang w:val="en-US"/>
+        </w:rPr>
+        <w:t>hd</w:t>
+      </w:r>
+      <w:r>
+        <w:rPr>
+          <w:rFonts w:eastAsiaTheme="minorHAnsi"/>
+          <w:color w:val="808080"/>
+          <w:sz w:val="26"/>
+          <w:szCs w:val="26"/>
+          <w:lang w:val="en-US"/>
+        </w:rPr>
+        <w:t>.</w:t>
+      </w:r>
+      <w:r>
+        <w:rPr>
+          <w:rFonts w:eastAsiaTheme="minorHAnsi"/>
+          <w:color w:val="000000"/>
+          <w:sz w:val="26"/>
+          <w:szCs w:val="26"/>
+          <w:lang w:val="en-US"/>
+        </w:rPr>
+        <w:t>NgayXuat</w:t>
+      </w:r>
+      <w:proofErr w:type="spellEnd"/>
+      <w:r>
+        <w:rPr>
+          <w:rFonts w:eastAsiaTheme="minorHAnsi"/>
+          <w:color w:val="808080"/>
+          <w:sz w:val="26"/>
+          <w:szCs w:val="26"/>
+          <w:lang w:val="en-US"/>
+        </w:rPr>
+        <w:t>,</w:t>
+      </w:r>
+      <w:r>
+        <w:rPr>
+          <w:rFonts w:eastAsiaTheme="minorHAnsi"/>
+          <w:color w:val="000000"/>
+          <w:sz w:val="26"/>
+          <w:szCs w:val="26"/>
+          <w:lang w:val="en-US"/>
+        </w:rPr>
+        <w:t xml:space="preserve"> </w:t>
+      </w:r>
+      <w:proofErr w:type="spellStart"/>
+      <w:r>
+        <w:rPr>
+          <w:rFonts w:eastAsiaTheme="minorHAnsi"/>
+          <w:color w:val="000000"/>
+          <w:sz w:val="26"/>
+          <w:szCs w:val="26"/>
+          <w:lang w:val="en-US"/>
+        </w:rPr>
+        <w:t>nv</w:t>
+      </w:r>
+      <w:r>
+        <w:rPr>
+          <w:rFonts w:eastAsiaTheme="minorHAnsi"/>
+          <w:color w:val="808080"/>
+          <w:sz w:val="26"/>
+          <w:szCs w:val="26"/>
+          <w:lang w:val="en-US"/>
+        </w:rPr>
+        <w:t>.</w:t>
+      </w:r>
+      <w:r>
+        <w:rPr>
+          <w:rFonts w:eastAsiaTheme="minorHAnsi"/>
+          <w:color w:val="000000"/>
+          <w:sz w:val="26"/>
+          <w:szCs w:val="26"/>
+          <w:lang w:val="en-US"/>
+        </w:rPr>
+        <w:t>MaNV</w:t>
+      </w:r>
+      <w:proofErr w:type="spellEnd"/>
+      <w:r>
+        <w:rPr>
+          <w:rFonts w:eastAsiaTheme="minorHAnsi"/>
+          <w:color w:val="808080"/>
+          <w:sz w:val="26"/>
+          <w:szCs w:val="26"/>
+          <w:lang w:val="en-US"/>
+        </w:rPr>
+        <w:t>,</w:t>
+      </w:r>
+      <w:r>
+        <w:rPr>
+          <w:rFonts w:eastAsiaTheme="minorHAnsi"/>
+          <w:color w:val="000000"/>
+          <w:sz w:val="26"/>
+          <w:szCs w:val="26"/>
+          <w:lang w:val="en-US"/>
+        </w:rPr>
+        <w:t xml:space="preserve"> </w:t>
+      </w:r>
+      <w:proofErr w:type="spellStart"/>
+      <w:r>
+        <w:rPr>
+          <w:rFonts w:eastAsiaTheme="minorHAnsi"/>
+          <w:color w:val="000000"/>
+          <w:sz w:val="26"/>
+          <w:szCs w:val="26"/>
+          <w:lang w:val="en-US"/>
+        </w:rPr>
+        <w:t>nv</w:t>
+      </w:r>
+      <w:r>
+        <w:rPr>
+          <w:rFonts w:eastAsiaTheme="minorHAnsi"/>
+          <w:color w:val="808080"/>
+          <w:sz w:val="26"/>
+          <w:szCs w:val="26"/>
+          <w:lang w:val="en-US"/>
+        </w:rPr>
+        <w:t>.</w:t>
+      </w:r>
+      <w:r>
+        <w:rPr>
+          <w:rFonts w:eastAsiaTheme="minorHAnsi"/>
+          <w:color w:val="000000"/>
+          <w:sz w:val="26"/>
+          <w:szCs w:val="26"/>
+          <w:lang w:val="en-US"/>
+        </w:rPr>
+        <w:t>HoTen</w:t>
+      </w:r>
+      <w:proofErr w:type="spellEnd"/>
+      <w:r>
+        <w:rPr>
+          <w:rFonts w:eastAsiaTheme="minorHAnsi"/>
+          <w:color w:val="808080"/>
+          <w:sz w:val="26"/>
+          <w:szCs w:val="26"/>
+          <w:lang w:val="en-US"/>
+        </w:rPr>
+        <w:t>,</w:t>
+      </w:r>
+      <w:r>
+        <w:rPr>
+          <w:rFonts w:eastAsiaTheme="minorHAnsi"/>
+          <w:color w:val="000000"/>
+          <w:sz w:val="26"/>
+          <w:szCs w:val="26"/>
+          <w:lang w:val="en-US"/>
+        </w:rPr>
+        <w:t xml:space="preserve"> </w:t>
+      </w:r>
+      <w:proofErr w:type="spellStart"/>
+      <w:r>
+        <w:rPr>
+          <w:rFonts w:eastAsiaTheme="minorHAnsi"/>
+          <w:color w:val="000000"/>
+          <w:sz w:val="26"/>
+          <w:szCs w:val="26"/>
+          <w:lang w:val="en-US"/>
+        </w:rPr>
+        <w:t>hd</w:t>
+      </w:r>
+      <w:r>
+        <w:rPr>
+          <w:rFonts w:eastAsiaTheme="minorHAnsi"/>
+          <w:color w:val="808080"/>
+          <w:sz w:val="26"/>
+          <w:szCs w:val="26"/>
+          <w:lang w:val="en-US"/>
+        </w:rPr>
+        <w:t>.</w:t>
+      </w:r>
+      <w:r>
+        <w:rPr>
+          <w:rFonts w:eastAsiaTheme="minorHAnsi"/>
+          <w:color w:val="000000"/>
+          <w:sz w:val="26"/>
+          <w:szCs w:val="26"/>
+          <w:lang w:val="en-US"/>
+        </w:rPr>
+        <w:t>TongTien</w:t>
+      </w:r>
+      <w:proofErr w:type="spellEnd"/>
+    </w:p>
+    <w:p>
+      <w:pPr>
+        <w:widowControl/>
+        <w:pBdr>
+          <w:top w:val="single" w:sz="4" w:space="1" w:color="auto"/>
+          <w:left w:val="single" w:sz="4" w:space="4" w:color="auto"/>
+          <w:bottom w:val="single" w:sz="4" w:space="1" w:color="auto"/>
+          <w:right w:val="single" w:sz="4" w:space="4" w:color="auto"/>
+        </w:pBdr>
+        <w:adjustRightInd w:val="0"/>
+        <w:ind w:left="460"/>
+        <w:rPr>
+          <w:rFonts w:eastAsiaTheme="minorHAnsi"/>
+          <w:color w:val="000000"/>
+          <w:sz w:val="26"/>
+          <w:szCs w:val="26"/>
+          <w:lang w:val="en-US"/>
+        </w:rPr>
+      </w:pPr>
+      <w:r>
+        <w:rPr>
+          <w:rFonts w:eastAsiaTheme="minorHAnsi"/>
+          <w:color w:val="0000FF"/>
+          <w:sz w:val="26"/>
+          <w:szCs w:val="26"/>
+          <w:lang w:val="en-US"/>
+        </w:rPr>
+        <w:t>FROM</w:t>
+      </w:r>
+      <w:r>
+        <w:rPr>
+          <w:rFonts w:eastAsiaTheme="minorHAnsi"/>
+          <w:color w:val="000000"/>
+          <w:sz w:val="26"/>
+          <w:szCs w:val="26"/>
+          <w:lang w:val="en-US"/>
+        </w:rPr>
+        <w:t xml:space="preserve"> HOADON </w:t>
+      </w:r>
+      <w:proofErr w:type="spellStart"/>
+      <w:r>
+        <w:rPr>
+          <w:rFonts w:eastAsiaTheme="minorHAnsi"/>
+          <w:color w:val="000000"/>
+          <w:sz w:val="26"/>
+          <w:szCs w:val="26"/>
+          <w:lang w:val="en-US"/>
+        </w:rPr>
+        <w:t>hd</w:t>
+      </w:r>
+      <w:proofErr w:type="spellEnd"/>
+      <w:r>
+        <w:rPr>
+          <w:rFonts w:eastAsiaTheme="minorHAnsi"/>
+          <w:color w:val="000000"/>
+          <w:sz w:val="26"/>
+          <w:szCs w:val="26"/>
+          <w:lang w:val="en-US"/>
+        </w:rPr>
+        <w:t xml:space="preserve"> </w:t>
+      </w:r>
+      <w:r>
+        <w:rPr>
+          <w:rFonts w:eastAsiaTheme="minorHAnsi"/>
+          <w:color w:val="808080"/>
+          <w:sz w:val="26"/>
+          <w:szCs w:val="26"/>
+          <w:lang w:val="en-US"/>
+        </w:rPr>
+        <w:t>JOIN</w:t>
+      </w:r>
+      <w:r>
+        <w:rPr>
+          <w:rFonts w:eastAsiaTheme="minorHAnsi"/>
+          <w:color w:val="000000"/>
+          <w:sz w:val="26"/>
+          <w:szCs w:val="26"/>
+          <w:lang w:val="en-US"/>
+        </w:rPr>
+        <w:t xml:space="preserve"> XUATHOADON </w:t>
+      </w:r>
+      <w:proofErr w:type="spellStart"/>
+      <w:r>
+        <w:rPr>
+          <w:rFonts w:eastAsiaTheme="minorHAnsi"/>
+          <w:color w:val="000000"/>
+          <w:sz w:val="26"/>
+          <w:szCs w:val="26"/>
+          <w:lang w:val="en-US"/>
+        </w:rPr>
+        <w:t>xhd</w:t>
+      </w:r>
+      <w:proofErr w:type="spellEnd"/>
+      <w:r>
+        <w:rPr>
+          <w:rFonts w:eastAsiaTheme="minorHAnsi"/>
+          <w:color w:val="000000"/>
+          <w:sz w:val="26"/>
+          <w:szCs w:val="26"/>
+          <w:lang w:val="en-US"/>
+        </w:rPr>
+        <w:t xml:space="preserve"> </w:t>
+      </w:r>
+      <w:r>
+        <w:rPr>
+          <w:rFonts w:eastAsiaTheme="minorHAnsi"/>
+          <w:color w:val="0000FF"/>
+          <w:sz w:val="26"/>
+          <w:szCs w:val="26"/>
+          <w:lang w:val="en-US"/>
+        </w:rPr>
+        <w:t>ON</w:t>
+      </w:r>
+      <w:r>
+        <w:rPr>
+          <w:rFonts w:eastAsiaTheme="minorHAnsi"/>
+          <w:color w:val="000000"/>
+          <w:sz w:val="26"/>
+          <w:szCs w:val="26"/>
+          <w:lang w:val="en-US"/>
+        </w:rPr>
+        <w:t xml:space="preserve"> </w:t>
+      </w:r>
+      <w:proofErr w:type="spellStart"/>
+      <w:r>
+        <w:rPr>
+          <w:rFonts w:eastAsiaTheme="minorHAnsi"/>
+          <w:color w:val="000000"/>
+          <w:sz w:val="26"/>
+          <w:szCs w:val="26"/>
+          <w:lang w:val="en-US"/>
+        </w:rPr>
+        <w:t>hd</w:t>
+      </w:r>
+      <w:r>
+        <w:rPr>
+          <w:rFonts w:eastAsiaTheme="minorHAnsi"/>
+          <w:color w:val="808080"/>
+          <w:sz w:val="26"/>
+          <w:szCs w:val="26"/>
+          <w:lang w:val="en-US"/>
+        </w:rPr>
+        <w:t>.</w:t>
+      </w:r>
+      <w:r>
+        <w:rPr>
+          <w:rFonts w:eastAsiaTheme="minorHAnsi"/>
+          <w:color w:val="000000"/>
+          <w:sz w:val="26"/>
+          <w:szCs w:val="26"/>
+          <w:lang w:val="en-US"/>
+        </w:rPr>
+        <w:t>MaHoaDon</w:t>
+      </w:r>
+      <w:proofErr w:type="spellEnd"/>
+      <w:r>
+        <w:rPr>
+          <w:rFonts w:eastAsiaTheme="minorHAnsi"/>
+          <w:color w:val="000000"/>
+          <w:sz w:val="26"/>
+          <w:szCs w:val="26"/>
+          <w:lang w:val="en-US"/>
+        </w:rPr>
+        <w:t xml:space="preserve"> </w:t>
+      </w:r>
+      <w:r>
+        <w:rPr>
+          <w:rFonts w:eastAsiaTheme="minorHAnsi"/>
+          <w:color w:val="808080"/>
+          <w:sz w:val="26"/>
+          <w:szCs w:val="26"/>
+          <w:lang w:val="en-US"/>
+        </w:rPr>
+        <w:t>=</w:t>
+      </w:r>
+      <w:r>
+        <w:rPr>
+          <w:rFonts w:eastAsiaTheme="minorHAnsi"/>
+          <w:color w:val="000000"/>
+          <w:sz w:val="26"/>
+          <w:szCs w:val="26"/>
+          <w:lang w:val="en-US"/>
+        </w:rPr>
+        <w:t xml:space="preserve"> </w:t>
+      </w:r>
+      <w:proofErr w:type="spellStart"/>
+      <w:r>
+        <w:rPr>
+          <w:rFonts w:eastAsiaTheme="minorHAnsi"/>
+          <w:color w:val="000000"/>
+          <w:sz w:val="26"/>
+          <w:szCs w:val="26"/>
+          <w:lang w:val="en-US"/>
+        </w:rPr>
+        <w:t>xhd</w:t>
+      </w:r>
+      <w:r>
+        <w:rPr>
+          <w:rFonts w:eastAsiaTheme="minorHAnsi"/>
+          <w:color w:val="808080"/>
+          <w:sz w:val="26"/>
+          <w:szCs w:val="26"/>
+          <w:lang w:val="en-US"/>
+        </w:rPr>
+        <w:t>.</w:t>
+      </w:r>
+      <w:r>
+        <w:rPr>
+          <w:rFonts w:eastAsiaTheme="minorHAnsi"/>
+          <w:color w:val="000000"/>
+          <w:sz w:val="26"/>
+          <w:szCs w:val="26"/>
+          <w:lang w:val="en-US"/>
+        </w:rPr>
+        <w:t>MaHoaDon</w:t>
+      </w:r>
+      <w:proofErr w:type="spellEnd"/>
+      <w:r>
+        <w:rPr>
+          <w:rFonts w:eastAsiaTheme="minorHAnsi"/>
+          <w:color w:val="000000"/>
+          <w:sz w:val="26"/>
+          <w:szCs w:val="26"/>
+          <w:lang w:val="en-US"/>
+        </w:rPr>
+        <w:t xml:space="preserve"> </w:t>
+      </w:r>
+      <w:r>
+        <w:rPr>
+          <w:rFonts w:eastAsiaTheme="minorHAnsi"/>
+          <w:color w:val="808080"/>
+          <w:sz w:val="26"/>
+          <w:szCs w:val="26"/>
+          <w:lang w:val="en-US"/>
+        </w:rPr>
+        <w:t>JOIN</w:t>
+      </w:r>
+      <w:r>
+        <w:rPr>
+          <w:rFonts w:eastAsiaTheme="minorHAnsi"/>
+          <w:color w:val="000000"/>
+          <w:sz w:val="26"/>
+          <w:szCs w:val="26"/>
+          <w:lang w:val="en-US"/>
+        </w:rPr>
+        <w:t xml:space="preserve"> NHANVIEN </w:t>
+      </w:r>
+      <w:proofErr w:type="spellStart"/>
+      <w:r>
+        <w:rPr>
+          <w:rFonts w:eastAsiaTheme="minorHAnsi"/>
+          <w:color w:val="000000"/>
+          <w:sz w:val="26"/>
+          <w:szCs w:val="26"/>
+          <w:lang w:val="en-US"/>
+        </w:rPr>
+        <w:t>nv</w:t>
+      </w:r>
+      <w:proofErr w:type="spellEnd"/>
+      <w:r>
+        <w:rPr>
+          <w:rFonts w:eastAsiaTheme="minorHAnsi"/>
+          <w:color w:val="000000"/>
+          <w:sz w:val="26"/>
+          <w:szCs w:val="26"/>
+          <w:lang w:val="en-US"/>
+        </w:rPr>
+        <w:t xml:space="preserve"> </w:t>
+      </w:r>
+      <w:r>
+        <w:rPr>
+          <w:rFonts w:eastAsiaTheme="minorHAnsi"/>
+          <w:color w:val="0000FF"/>
+          <w:sz w:val="26"/>
+          <w:szCs w:val="26"/>
+          <w:lang w:val="en-US"/>
+        </w:rPr>
+        <w:t>ON</w:t>
+      </w:r>
+      <w:r>
+        <w:rPr>
+          <w:rFonts w:eastAsiaTheme="minorHAnsi"/>
+          <w:color w:val="000000"/>
+          <w:sz w:val="26"/>
+          <w:szCs w:val="26"/>
+          <w:lang w:val="en-US"/>
+        </w:rPr>
+        <w:t xml:space="preserve"> </w:t>
+      </w:r>
+      <w:proofErr w:type="spellStart"/>
+      <w:r>
+        <w:rPr>
+          <w:rFonts w:eastAsiaTheme="minorHAnsi"/>
+          <w:color w:val="000000"/>
+          <w:sz w:val="26"/>
+          <w:szCs w:val="26"/>
+          <w:lang w:val="en-US"/>
+        </w:rPr>
+        <w:t>nv</w:t>
+      </w:r>
+      <w:r>
+        <w:rPr>
+          <w:rFonts w:eastAsiaTheme="minorHAnsi"/>
+          <w:color w:val="808080"/>
+          <w:sz w:val="26"/>
+          <w:szCs w:val="26"/>
+          <w:lang w:val="en-US"/>
+        </w:rPr>
+        <w:t>.</w:t>
+      </w:r>
+      <w:r>
+        <w:rPr>
+          <w:rFonts w:eastAsiaTheme="minorHAnsi"/>
+          <w:color w:val="000000"/>
+          <w:sz w:val="26"/>
+          <w:szCs w:val="26"/>
+          <w:lang w:val="en-US"/>
+        </w:rPr>
+        <w:t>MaNV</w:t>
+      </w:r>
+      <w:proofErr w:type="spellEnd"/>
+      <w:r>
+        <w:rPr>
+          <w:rFonts w:eastAsiaTheme="minorHAnsi"/>
+          <w:color w:val="000000"/>
+          <w:sz w:val="26"/>
+          <w:szCs w:val="26"/>
+          <w:lang w:val="en-US"/>
+        </w:rPr>
+        <w:t xml:space="preserve"> </w:t>
+      </w:r>
+      <w:r>
+        <w:rPr>
+          <w:rFonts w:eastAsiaTheme="minorHAnsi"/>
+          <w:color w:val="808080"/>
+          <w:sz w:val="26"/>
+          <w:szCs w:val="26"/>
+          <w:lang w:val="en-US"/>
+        </w:rPr>
+        <w:t>=</w:t>
+      </w:r>
+      <w:r>
+        <w:rPr>
+          <w:rFonts w:eastAsiaTheme="minorHAnsi"/>
+          <w:color w:val="000000"/>
+          <w:sz w:val="26"/>
+          <w:szCs w:val="26"/>
+          <w:lang w:val="en-US"/>
+        </w:rPr>
+        <w:t xml:space="preserve"> </w:t>
+      </w:r>
+      <w:proofErr w:type="spellStart"/>
+      <w:r>
+        <w:rPr>
+          <w:rFonts w:eastAsiaTheme="minorHAnsi"/>
+          <w:color w:val="000000"/>
+          <w:sz w:val="26"/>
+          <w:szCs w:val="26"/>
+          <w:lang w:val="en-US"/>
+        </w:rPr>
+        <w:t>xhd</w:t>
+      </w:r>
+      <w:r>
+        <w:rPr>
+          <w:rFonts w:eastAsiaTheme="minorHAnsi"/>
+          <w:color w:val="808080"/>
+          <w:sz w:val="26"/>
+          <w:szCs w:val="26"/>
+          <w:lang w:val="en-US"/>
+        </w:rPr>
+        <w:t>.</w:t>
+      </w:r>
+      <w:r>
+        <w:rPr>
+          <w:rFonts w:eastAsiaTheme="minorHAnsi"/>
+          <w:color w:val="000000"/>
+          <w:sz w:val="26"/>
+          <w:szCs w:val="26"/>
+          <w:lang w:val="en-US"/>
+        </w:rPr>
+        <w:t>MaNV</w:t>
+      </w:r>
+      <w:proofErr w:type="spellEnd"/>
+    </w:p>
+    <w:p>
+      <w:pPr>
+        <w:widowControl/>
+        <w:adjustRightInd w:val="0"/>
+        <w:ind w:left="460"/>
+        <w:rPr>
+          <w:rFonts w:eastAsiaTheme="minorHAnsi"/>
+          <w:color w:val="000000"/>
+          <w:sz w:val="26"/>
+          <w:szCs w:val="26"/>
+          <w:lang w:val="en-US"/>
+        </w:rPr>
+      </w:pPr>
+    </w:p>
+    <w:p>
+      <w:pPr>
+        <w:widowControl/>
+        <w:adjustRightInd w:val="0"/>
+        <w:ind w:left="460"/>
+        <w:rPr>
+          <w:rFonts w:eastAsiaTheme="minorHAnsi"/>
+          <w:color w:val="000000"/>
+          <w:sz w:val="26"/>
+          <w:szCs w:val="26"/>
+          <w:lang w:val="en-US"/>
+        </w:rPr>
+      </w:pPr>
+      <w:proofErr w:type="spellStart"/>
+      <w:r>
+        <w:rPr>
+          <w:rFonts w:eastAsiaTheme="minorHAnsi"/>
+          <w:color w:val="000000"/>
+          <w:sz w:val="26"/>
+          <w:szCs w:val="26"/>
+          <w:lang w:val="en-US"/>
+        </w:rPr>
+        <w:t>Thực</w:t>
+      </w:r>
+      <w:proofErr w:type="spellEnd"/>
+      <w:r>
+        <w:rPr>
+          <w:rFonts w:eastAsiaTheme="minorHAnsi"/>
+          <w:color w:val="000000"/>
+          <w:sz w:val="26"/>
+          <w:szCs w:val="26"/>
+          <w:lang w:val="en-US"/>
+        </w:rPr>
+        <w:t xml:space="preserve"> </w:t>
+      </w:r>
+      <w:proofErr w:type="spellStart"/>
+      <w:r>
+        <w:rPr>
+          <w:rFonts w:eastAsiaTheme="minorHAnsi"/>
+          <w:color w:val="000000"/>
+          <w:sz w:val="26"/>
+          <w:szCs w:val="26"/>
+          <w:lang w:val="en-US"/>
+        </w:rPr>
+        <w:t>thi</w:t>
+      </w:r>
+      <w:proofErr w:type="spellEnd"/>
+      <w:r>
+        <w:rPr>
+          <w:rFonts w:eastAsiaTheme="minorHAnsi"/>
+          <w:color w:val="000000"/>
+          <w:sz w:val="26"/>
+          <w:szCs w:val="26"/>
+          <w:lang w:val="en-US"/>
+        </w:rPr>
+        <w:t xml:space="preserve"> </w:t>
+      </w:r>
+      <w:proofErr w:type="spellStart"/>
+      <w:r>
+        <w:rPr>
+          <w:rFonts w:eastAsiaTheme="minorHAnsi"/>
+          <w:color w:val="000000"/>
+          <w:sz w:val="26"/>
+          <w:szCs w:val="26"/>
+          <w:lang w:val="en-US"/>
+        </w:rPr>
+        <w:t>trên</w:t>
+      </w:r>
+      <w:proofErr w:type="spellEnd"/>
+      <w:r>
+        <w:rPr>
+          <w:rFonts w:eastAsiaTheme="minorHAnsi"/>
+          <w:color w:val="000000"/>
+          <w:sz w:val="26"/>
+          <w:szCs w:val="26"/>
+          <w:lang w:val="en-US"/>
+        </w:rPr>
+        <w:t xml:space="preserve"> C#:</w:t>
+      </w:r>
+    </w:p>
+    <w:p>
+      <w:pPr>
+        <w:widowControl/>
+        <w:adjustRightInd w:val="0"/>
+        <w:ind w:left="460"/>
+        <w:rPr>
+          <w:rFonts w:eastAsiaTheme="minorHAnsi"/>
+          <w:color w:val="000000"/>
+          <w:sz w:val="26"/>
+          <w:szCs w:val="26"/>
+          <w:lang w:val="en-US"/>
+        </w:rPr>
+      </w:pPr>
+    </w:p>
+    <w:p>
+      <w:pPr>
+        <w:widowControl/>
+        <w:pBdr>
+          <w:top w:val="single" w:sz="4" w:space="1" w:color="auto"/>
+          <w:left w:val="single" w:sz="4" w:space="4" w:color="auto"/>
+          <w:bottom w:val="single" w:sz="4" w:space="1" w:color="auto"/>
+          <w:right w:val="single" w:sz="4" w:space="4" w:color="auto"/>
+        </w:pBdr>
+        <w:adjustRightInd w:val="0"/>
+        <w:ind w:left="460"/>
+        <w:rPr>
+          <w:rFonts w:eastAsiaTheme="minorHAnsi"/>
+          <w:color w:val="000000"/>
+          <w:sz w:val="26"/>
+          <w:szCs w:val="26"/>
+          <w:lang w:val="en-US"/>
+        </w:rPr>
+      </w:pPr>
+      <w:r>
+        <w:rPr>
+          <w:rFonts w:eastAsiaTheme="minorHAnsi"/>
+          <w:color w:val="000000"/>
+          <w:sz w:val="26"/>
+          <w:szCs w:val="26"/>
+          <w:lang w:val="en-US"/>
+        </w:rPr>
+        <w:t xml:space="preserve">public static </w:t>
+      </w:r>
+      <w:proofErr w:type="spellStart"/>
+      <w:r>
+        <w:rPr>
+          <w:rFonts w:eastAsiaTheme="minorHAnsi"/>
+          <w:color w:val="000000"/>
+          <w:sz w:val="26"/>
+          <w:szCs w:val="26"/>
+          <w:lang w:val="en-US"/>
+        </w:rPr>
+        <w:t>DataTable</w:t>
+      </w:r>
+      <w:proofErr w:type="spellEnd"/>
+      <w:r>
+        <w:rPr>
+          <w:rFonts w:eastAsiaTheme="minorHAnsi"/>
+          <w:color w:val="000000"/>
+          <w:sz w:val="26"/>
+          <w:szCs w:val="26"/>
+          <w:lang w:val="en-US"/>
+        </w:rPr>
+        <w:t xml:space="preserve"> </w:t>
+      </w:r>
+      <w:proofErr w:type="spellStart"/>
+      <w:r>
+        <w:rPr>
+          <w:rFonts w:eastAsiaTheme="minorHAnsi"/>
+          <w:color w:val="000000"/>
+          <w:sz w:val="26"/>
+          <w:szCs w:val="26"/>
+          <w:lang w:val="en-US"/>
+        </w:rPr>
+        <w:t>salesReceipts</w:t>
+      </w:r>
+      <w:proofErr w:type="spellEnd"/>
+      <w:r>
+        <w:rPr>
+          <w:rFonts w:eastAsiaTheme="minorHAnsi"/>
+          <w:color w:val="000000"/>
+          <w:sz w:val="26"/>
+          <w:szCs w:val="26"/>
+          <w:lang w:val="en-US"/>
+        </w:rPr>
+        <w:t>(</w:t>
+      </w:r>
+      <w:proofErr w:type="spellStart"/>
+      <w:r>
+        <w:rPr>
+          <w:rFonts w:eastAsiaTheme="minorHAnsi"/>
+          <w:color w:val="000000"/>
+          <w:sz w:val="26"/>
+          <w:szCs w:val="26"/>
+          <w:lang w:val="en-US"/>
+        </w:rPr>
+        <w:t>DBConn</w:t>
+      </w:r>
+      <w:proofErr w:type="spellEnd"/>
+      <w:r>
+        <w:rPr>
+          <w:rFonts w:eastAsiaTheme="minorHAnsi"/>
+          <w:color w:val="000000"/>
+          <w:sz w:val="26"/>
+          <w:szCs w:val="26"/>
+          <w:lang w:val="en-US"/>
+        </w:rPr>
+        <w:t xml:space="preserve"> </w:t>
+      </w:r>
+      <w:proofErr w:type="spellStart"/>
+      <w:r>
+        <w:rPr>
+          <w:rFonts w:eastAsiaTheme="minorHAnsi"/>
+          <w:color w:val="000000"/>
+          <w:sz w:val="26"/>
+          <w:szCs w:val="26"/>
+          <w:lang w:val="en-US"/>
+        </w:rPr>
+        <w:t>db</w:t>
+      </w:r>
+      <w:proofErr w:type="spellEnd"/>
+      <w:r>
+        <w:rPr>
+          <w:rFonts w:eastAsiaTheme="minorHAnsi"/>
+          <w:color w:val="000000"/>
+          <w:sz w:val="26"/>
+          <w:szCs w:val="26"/>
+          <w:lang w:val="en-US"/>
+        </w:rPr>
+        <w:t>)</w:t>
+      </w:r>
+    </w:p>
+    <w:p>
+      <w:pPr>
+        <w:widowControl/>
+        <w:pBdr>
+          <w:top w:val="single" w:sz="4" w:space="1" w:color="auto"/>
+          <w:left w:val="single" w:sz="4" w:space="4" w:color="auto"/>
+          <w:bottom w:val="single" w:sz="4" w:space="1" w:color="auto"/>
+          <w:right w:val="single" w:sz="4" w:space="4" w:color="auto"/>
+        </w:pBdr>
+        <w:adjustRightInd w:val="0"/>
+        <w:ind w:left="460"/>
+        <w:rPr>
+          <w:rFonts w:eastAsiaTheme="minorHAnsi"/>
+          <w:color w:val="000000"/>
+          <w:sz w:val="26"/>
+          <w:szCs w:val="26"/>
+          <w:lang w:val="en-US"/>
+        </w:rPr>
+      </w:pPr>
+      <w:r>
+        <w:rPr>
+          <w:rFonts w:eastAsiaTheme="minorHAnsi"/>
+          <w:color w:val="000000"/>
+          <w:sz w:val="26"/>
+          <w:szCs w:val="26"/>
+          <w:lang w:val="en-US"/>
+        </w:rPr>
+        <w:t>{</w:t>
+      </w:r>
+    </w:p>
+    <w:p>
+      <w:pPr>
+        <w:widowControl/>
+        <w:pBdr>
+          <w:top w:val="single" w:sz="4" w:space="1" w:color="auto"/>
+          <w:left w:val="single" w:sz="4" w:space="4" w:color="auto"/>
+          <w:bottom w:val="single" w:sz="4" w:space="1" w:color="auto"/>
+          <w:right w:val="single" w:sz="4" w:space="4" w:color="auto"/>
+        </w:pBdr>
+        <w:adjustRightInd w:val="0"/>
+        <w:ind w:left="460"/>
+        <w:rPr>
+          <w:rFonts w:eastAsiaTheme="minorHAnsi"/>
+          <w:color w:val="000000"/>
+          <w:sz w:val="26"/>
+          <w:szCs w:val="26"/>
+          <w:lang w:val="en-US"/>
+        </w:rPr>
+      </w:pPr>
+      <w:r>
+        <w:rPr>
+          <w:rFonts w:eastAsiaTheme="minorHAnsi"/>
+          <w:color w:val="000000"/>
+          <w:sz w:val="26"/>
+          <w:szCs w:val="26"/>
+          <w:lang w:val="en-US"/>
+        </w:rPr>
+        <w:t xml:space="preserve">    string </w:t>
+      </w:r>
+      <w:proofErr w:type="spellStart"/>
+      <w:r>
+        <w:rPr>
+          <w:rFonts w:eastAsiaTheme="minorHAnsi"/>
+          <w:color w:val="000000"/>
+          <w:sz w:val="26"/>
+          <w:szCs w:val="26"/>
+          <w:lang w:val="en-US"/>
+        </w:rPr>
+        <w:t>sqlquery</w:t>
+      </w:r>
+      <w:proofErr w:type="spellEnd"/>
+      <w:r>
+        <w:rPr>
+          <w:rFonts w:eastAsiaTheme="minorHAnsi"/>
+          <w:color w:val="000000"/>
+          <w:sz w:val="26"/>
+          <w:szCs w:val="26"/>
+          <w:lang w:val="en-US"/>
+        </w:rPr>
+        <w:t xml:space="preserve"> = "SELECT * FROM </w:t>
+      </w:r>
+      <w:proofErr w:type="spellStart"/>
+      <w:r>
+        <w:rPr>
+          <w:rFonts w:eastAsiaTheme="minorHAnsi"/>
+          <w:color w:val="000000"/>
+          <w:sz w:val="26"/>
+          <w:szCs w:val="26"/>
+          <w:lang w:val="en-US"/>
+        </w:rPr>
+        <w:t>v_DanhMucHoaDon</w:t>
+      </w:r>
+      <w:proofErr w:type="spellEnd"/>
+      <w:r>
+        <w:rPr>
+          <w:rFonts w:eastAsiaTheme="minorHAnsi"/>
+          <w:color w:val="000000"/>
+          <w:sz w:val="26"/>
+          <w:szCs w:val="26"/>
+          <w:lang w:val="en-US"/>
+        </w:rPr>
+        <w:t>";</w:t>
+      </w:r>
+    </w:p>
+    <w:p>
+      <w:pPr>
+        <w:widowControl/>
+        <w:pBdr>
+          <w:top w:val="single" w:sz="4" w:space="1" w:color="auto"/>
+          <w:left w:val="single" w:sz="4" w:space="4" w:color="auto"/>
+          <w:bottom w:val="single" w:sz="4" w:space="1" w:color="auto"/>
+          <w:right w:val="single" w:sz="4" w:space="4" w:color="auto"/>
+        </w:pBdr>
+        <w:adjustRightInd w:val="0"/>
+        <w:ind w:left="460"/>
+        <w:rPr>
+          <w:rFonts w:eastAsiaTheme="minorHAnsi"/>
+          <w:color w:val="000000"/>
+          <w:sz w:val="26"/>
+          <w:szCs w:val="26"/>
+          <w:lang w:val="en-US"/>
+        </w:rPr>
+      </w:pPr>
+      <w:r>
+        <w:rPr>
+          <w:rFonts w:eastAsiaTheme="minorHAnsi"/>
+          <w:color w:val="000000"/>
+          <w:sz w:val="26"/>
+          <w:szCs w:val="26"/>
+          <w:lang w:val="en-US"/>
+        </w:rPr>
+        <w:t xml:space="preserve">    return </w:t>
+      </w:r>
+      <w:proofErr w:type="spellStart"/>
+      <w:r>
+        <w:rPr>
+          <w:rFonts w:eastAsiaTheme="minorHAnsi"/>
+          <w:color w:val="000000"/>
+          <w:sz w:val="26"/>
+          <w:szCs w:val="26"/>
+          <w:lang w:val="en-US"/>
+        </w:rPr>
+        <w:t>LoadTable</w:t>
+      </w:r>
+      <w:proofErr w:type="spellEnd"/>
+      <w:r>
+        <w:rPr>
+          <w:rFonts w:eastAsiaTheme="minorHAnsi"/>
+          <w:color w:val="000000"/>
+          <w:sz w:val="26"/>
+          <w:szCs w:val="26"/>
+          <w:lang w:val="en-US"/>
+        </w:rPr>
+        <w:t>(</w:t>
+      </w:r>
+      <w:proofErr w:type="spellStart"/>
+      <w:r>
+        <w:rPr>
+          <w:rFonts w:eastAsiaTheme="minorHAnsi"/>
+          <w:color w:val="000000"/>
+          <w:sz w:val="26"/>
+          <w:szCs w:val="26"/>
+          <w:lang w:val="en-US"/>
+        </w:rPr>
+        <w:t>db</w:t>
+      </w:r>
+      <w:proofErr w:type="spellEnd"/>
+      <w:r>
+        <w:rPr>
+          <w:rFonts w:eastAsiaTheme="minorHAnsi"/>
+          <w:color w:val="000000"/>
+          <w:sz w:val="26"/>
+          <w:szCs w:val="26"/>
+          <w:lang w:val="en-US"/>
+        </w:rPr>
+        <w:t xml:space="preserve">, </w:t>
+      </w:r>
+      <w:proofErr w:type="spellStart"/>
+      <w:r>
+        <w:rPr>
+          <w:rFonts w:eastAsiaTheme="minorHAnsi"/>
+          <w:color w:val="000000"/>
+          <w:sz w:val="26"/>
+          <w:szCs w:val="26"/>
+          <w:lang w:val="en-US"/>
+        </w:rPr>
+        <w:t>sqlquery</w:t>
+      </w:r>
+      <w:proofErr w:type="spellEnd"/>
+      <w:r>
+        <w:rPr>
+          <w:rFonts w:eastAsiaTheme="minorHAnsi"/>
+          <w:color w:val="000000"/>
+          <w:sz w:val="26"/>
+          <w:szCs w:val="26"/>
+          <w:lang w:val="en-US"/>
+        </w:rPr>
+        <w:t>);</w:t>
+      </w:r>
+    </w:p>
+    <w:p>
+      <w:pPr>
+        <w:widowControl/>
+        <w:pBdr>
+          <w:top w:val="single" w:sz="4" w:space="1" w:color="auto"/>
+          <w:left w:val="single" w:sz="4" w:space="4" w:color="auto"/>
+          <w:bottom w:val="single" w:sz="4" w:space="1" w:color="auto"/>
+          <w:right w:val="single" w:sz="4" w:space="4" w:color="auto"/>
+        </w:pBdr>
+        <w:adjustRightInd w:val="0"/>
+        <w:ind w:left="460"/>
+        <w:rPr>
+          <w:rFonts w:eastAsiaTheme="minorHAnsi"/>
+          <w:color w:val="000000"/>
+          <w:sz w:val="26"/>
+          <w:szCs w:val="26"/>
+          <w:lang w:val="en-US"/>
+        </w:rPr>
+      </w:pPr>
+      <w:r>
+        <w:rPr>
+          <w:rFonts w:eastAsiaTheme="minorHAnsi"/>
+          <w:color w:val="000000"/>
+          <w:sz w:val="26"/>
+          <w:szCs w:val="26"/>
+          <w:lang w:val="en-US"/>
+        </w:rPr>
+        <w:t>}</w:t>
+      </w:r>
+    </w:p>
+    <w:p>
+      <w:pPr>
+        <w:pStyle w:val="ListParagraph"/>
+        <w:numPr>
+          <w:ilvl w:val="1"/>
+          <w:numId w:val="20"/>
+        </w:numPr>
+        <w:spacing w:before="209"/>
+        <w:rPr>
+          <w:b/>
+          <w:bCs/>
+          <w:sz w:val="26"/>
+          <w:szCs w:val="26"/>
+        </w:rPr>
+      </w:pPr>
+      <w:r>
+        <w:rPr>
+          <w:b/>
+          <w:bCs/>
+          <w:sz w:val="26"/>
+          <w:szCs w:val="26"/>
+        </w:rPr>
+        <w:t>Danh mục</w:t>
+      </w:r>
+      <w:r>
+        <w:rPr>
+          <w:b/>
+          <w:bCs/>
+          <w:sz w:val="26"/>
+          <w:szCs w:val="26"/>
+          <w:lang w:val="en-US"/>
+        </w:rPr>
+        <w:t xml:space="preserve"> ca </w:t>
+      </w:r>
+      <w:proofErr w:type="spellStart"/>
+      <w:r>
+        <w:rPr>
+          <w:b/>
+          <w:bCs/>
+          <w:sz w:val="26"/>
+          <w:szCs w:val="26"/>
+          <w:lang w:val="en-US"/>
+        </w:rPr>
+        <w:t>làm</w:t>
+      </w:r>
+      <w:proofErr w:type="spellEnd"/>
+      <w:r>
+        <w:rPr>
+          <w:b/>
+          <w:bCs/>
+          <w:sz w:val="26"/>
+          <w:szCs w:val="26"/>
+          <w:lang w:val="en-US"/>
+        </w:rPr>
+        <w:t xml:space="preserve"> </w:t>
+      </w:r>
+      <w:proofErr w:type="spellStart"/>
+      <w:r>
+        <w:rPr>
+          <w:b/>
+          <w:bCs/>
+          <w:sz w:val="26"/>
+          <w:szCs w:val="26"/>
+          <w:lang w:val="en-US"/>
+        </w:rPr>
+        <w:t>việc</w:t>
+      </w:r>
+      <w:proofErr w:type="spellEnd"/>
+      <w:r>
+        <w:rPr>
+          <w:b/>
+          <w:bCs/>
+          <w:sz w:val="26"/>
+          <w:szCs w:val="26"/>
+        </w:rPr>
+        <w:t>:</w:t>
+      </w:r>
+    </w:p>
+    <w:p>
+      <w:pPr>
+        <w:widowControl/>
+        <w:adjustRightInd w:val="0"/>
+        <w:ind w:left="460"/>
+        <w:rPr>
+          <w:rFonts w:eastAsiaTheme="minorHAnsi"/>
+          <w:color w:val="000000"/>
+          <w:sz w:val="26"/>
+          <w:szCs w:val="26"/>
+          <w:lang w:val="en-US"/>
+        </w:rPr>
+      </w:pPr>
+    </w:p>
+    <w:p>
+      <w:pPr>
+        <w:widowControl/>
+        <w:adjustRightInd w:val="0"/>
+        <w:ind w:left="460"/>
+        <w:rPr>
+          <w:rFonts w:eastAsiaTheme="minorHAnsi"/>
+          <w:color w:val="000000"/>
+          <w:sz w:val="26"/>
+          <w:szCs w:val="26"/>
+          <w:lang w:val="en-US"/>
+        </w:rPr>
+      </w:pPr>
+      <w:proofErr w:type="spellStart"/>
+      <w:r>
+        <w:rPr>
+          <w:rFonts w:eastAsiaTheme="minorHAnsi"/>
+          <w:color w:val="000000"/>
+          <w:sz w:val="26"/>
+          <w:szCs w:val="26"/>
+          <w:lang w:val="en-US"/>
+        </w:rPr>
+        <w:t>Thực</w:t>
+      </w:r>
+      <w:proofErr w:type="spellEnd"/>
+      <w:r>
+        <w:rPr>
+          <w:rFonts w:eastAsiaTheme="minorHAnsi"/>
+          <w:color w:val="000000"/>
+          <w:sz w:val="26"/>
+          <w:szCs w:val="26"/>
+          <w:lang w:val="en-US"/>
+        </w:rPr>
+        <w:t xml:space="preserve"> </w:t>
+      </w:r>
+      <w:proofErr w:type="spellStart"/>
+      <w:r>
+        <w:rPr>
+          <w:rFonts w:eastAsiaTheme="minorHAnsi"/>
+          <w:color w:val="000000"/>
+          <w:sz w:val="26"/>
+          <w:szCs w:val="26"/>
+          <w:lang w:val="en-US"/>
+        </w:rPr>
+        <w:t>thi</w:t>
+      </w:r>
+      <w:proofErr w:type="spellEnd"/>
+      <w:r>
+        <w:rPr>
+          <w:rFonts w:eastAsiaTheme="minorHAnsi"/>
+          <w:color w:val="000000"/>
+          <w:sz w:val="26"/>
+          <w:szCs w:val="26"/>
+          <w:lang w:val="en-US"/>
+        </w:rPr>
+        <w:t xml:space="preserve"> </w:t>
+      </w:r>
+      <w:proofErr w:type="spellStart"/>
+      <w:r>
+        <w:rPr>
+          <w:rFonts w:eastAsiaTheme="minorHAnsi"/>
+          <w:color w:val="000000"/>
+          <w:sz w:val="26"/>
+          <w:szCs w:val="26"/>
+          <w:lang w:val="en-US"/>
+        </w:rPr>
+        <w:t>trên</w:t>
+      </w:r>
+      <w:proofErr w:type="spellEnd"/>
+      <w:r>
+        <w:rPr>
+          <w:rFonts w:eastAsiaTheme="minorHAnsi"/>
+          <w:color w:val="000000"/>
+          <w:sz w:val="26"/>
+          <w:szCs w:val="26"/>
+          <w:lang w:val="en-US"/>
+        </w:rPr>
+        <w:t xml:space="preserve"> C#:</w:t>
+      </w:r>
+    </w:p>
+    <w:p>
+      <w:pPr>
+        <w:widowControl/>
+        <w:adjustRightInd w:val="0"/>
+        <w:ind w:left="460"/>
+        <w:rPr>
+          <w:rFonts w:eastAsiaTheme="minorHAnsi"/>
+          <w:color w:val="000000"/>
+          <w:sz w:val="26"/>
+          <w:szCs w:val="26"/>
+          <w:lang w:val="en-US"/>
+        </w:rPr>
+      </w:pPr>
+    </w:p>
+    <w:p>
+      <w:pPr>
+        <w:widowControl/>
+        <w:pBdr>
+          <w:top w:val="single" w:sz="4" w:space="1" w:color="auto"/>
+          <w:left w:val="single" w:sz="4" w:space="4" w:color="auto"/>
+          <w:bottom w:val="single" w:sz="4" w:space="1" w:color="auto"/>
+          <w:right w:val="single" w:sz="4" w:space="4" w:color="auto"/>
+        </w:pBdr>
+        <w:adjustRightInd w:val="0"/>
+        <w:ind w:left="460"/>
+        <w:rPr>
+          <w:rFonts w:eastAsiaTheme="minorHAnsi"/>
+          <w:color w:val="000000"/>
+          <w:sz w:val="26"/>
+          <w:szCs w:val="26"/>
+          <w:lang w:val="en-US"/>
+        </w:rPr>
+      </w:pPr>
+      <w:r>
+        <w:rPr>
+          <w:rFonts w:eastAsiaTheme="minorHAnsi"/>
+          <w:color w:val="000000"/>
+          <w:sz w:val="26"/>
+          <w:szCs w:val="26"/>
+          <w:lang w:val="en-US"/>
+        </w:rPr>
+        <w:t xml:space="preserve">public static </w:t>
+      </w:r>
+      <w:proofErr w:type="spellStart"/>
+      <w:r>
+        <w:rPr>
+          <w:rFonts w:eastAsiaTheme="minorHAnsi"/>
+          <w:color w:val="000000"/>
+          <w:sz w:val="26"/>
+          <w:szCs w:val="26"/>
+          <w:lang w:val="en-US"/>
+        </w:rPr>
+        <w:t>DataTable</w:t>
+      </w:r>
+      <w:proofErr w:type="spellEnd"/>
+      <w:r>
+        <w:rPr>
+          <w:rFonts w:eastAsiaTheme="minorHAnsi"/>
+          <w:color w:val="000000"/>
+          <w:sz w:val="26"/>
+          <w:szCs w:val="26"/>
+          <w:lang w:val="en-US"/>
+        </w:rPr>
+        <w:t xml:space="preserve"> </w:t>
+      </w:r>
+      <w:proofErr w:type="spellStart"/>
+      <w:r>
+        <w:rPr>
+          <w:rFonts w:eastAsiaTheme="minorHAnsi"/>
+          <w:color w:val="000000"/>
+          <w:sz w:val="26"/>
+          <w:szCs w:val="26"/>
+          <w:lang w:val="en-US"/>
+        </w:rPr>
+        <w:t>shiftSchedule</w:t>
+      </w:r>
+      <w:proofErr w:type="spellEnd"/>
+      <w:r>
+        <w:rPr>
+          <w:rFonts w:eastAsiaTheme="minorHAnsi"/>
+          <w:color w:val="000000"/>
+          <w:sz w:val="26"/>
+          <w:szCs w:val="26"/>
+          <w:lang w:val="en-US"/>
+        </w:rPr>
+        <w:t>(</w:t>
+      </w:r>
+      <w:proofErr w:type="spellStart"/>
+      <w:r>
+        <w:rPr>
+          <w:rFonts w:eastAsiaTheme="minorHAnsi"/>
+          <w:color w:val="000000"/>
+          <w:sz w:val="26"/>
+          <w:szCs w:val="26"/>
+          <w:lang w:val="en-US"/>
+        </w:rPr>
+        <w:t>DBConn</w:t>
+      </w:r>
+      <w:proofErr w:type="spellEnd"/>
+      <w:r>
+        <w:rPr>
+          <w:rFonts w:eastAsiaTheme="minorHAnsi"/>
+          <w:color w:val="000000"/>
+          <w:sz w:val="26"/>
+          <w:szCs w:val="26"/>
+          <w:lang w:val="en-US"/>
+        </w:rPr>
+        <w:t xml:space="preserve"> </w:t>
+      </w:r>
+      <w:proofErr w:type="spellStart"/>
+      <w:r>
+        <w:rPr>
+          <w:rFonts w:eastAsiaTheme="minorHAnsi"/>
+          <w:color w:val="000000"/>
+          <w:sz w:val="26"/>
+          <w:szCs w:val="26"/>
+          <w:lang w:val="en-US"/>
+        </w:rPr>
+        <w:t>db</w:t>
+      </w:r>
+      <w:proofErr w:type="spellEnd"/>
+      <w:r>
+        <w:rPr>
+          <w:rFonts w:eastAsiaTheme="minorHAnsi"/>
+          <w:color w:val="000000"/>
+          <w:sz w:val="26"/>
+          <w:szCs w:val="26"/>
+          <w:lang w:val="en-US"/>
+        </w:rPr>
+        <w:t>)</w:t>
+      </w:r>
+    </w:p>
+    <w:p>
+      <w:pPr>
+        <w:widowControl/>
+        <w:pBdr>
+          <w:top w:val="single" w:sz="4" w:space="1" w:color="auto"/>
+          <w:left w:val="single" w:sz="4" w:space="4" w:color="auto"/>
+          <w:bottom w:val="single" w:sz="4" w:space="1" w:color="auto"/>
+          <w:right w:val="single" w:sz="4" w:space="4" w:color="auto"/>
+        </w:pBdr>
+        <w:adjustRightInd w:val="0"/>
+        <w:ind w:left="460"/>
+        <w:rPr>
+          <w:rFonts w:eastAsiaTheme="minorHAnsi"/>
+          <w:color w:val="000000"/>
+          <w:sz w:val="26"/>
+          <w:szCs w:val="26"/>
+          <w:lang w:val="en-US"/>
+        </w:rPr>
+      </w:pPr>
+      <w:r>
+        <w:rPr>
+          <w:rFonts w:eastAsiaTheme="minorHAnsi"/>
+          <w:color w:val="000000"/>
+          <w:sz w:val="26"/>
+          <w:szCs w:val="26"/>
+          <w:lang w:val="en-US"/>
+        </w:rPr>
+        <w:t>{</w:t>
+      </w:r>
+    </w:p>
+    <w:p>
+      <w:pPr>
+        <w:widowControl/>
+        <w:pBdr>
+          <w:top w:val="single" w:sz="4" w:space="1" w:color="auto"/>
+          <w:left w:val="single" w:sz="4" w:space="4" w:color="auto"/>
+          <w:bottom w:val="single" w:sz="4" w:space="1" w:color="auto"/>
+          <w:right w:val="single" w:sz="4" w:space="4" w:color="auto"/>
+        </w:pBdr>
+        <w:adjustRightInd w:val="0"/>
+        <w:ind w:left="460"/>
+        <w:rPr>
+          <w:rFonts w:eastAsiaTheme="minorHAnsi"/>
+          <w:color w:val="000000"/>
+          <w:sz w:val="26"/>
+          <w:szCs w:val="26"/>
+          <w:lang w:val="en-US"/>
+        </w:rPr>
+      </w:pPr>
+      <w:r>
+        <w:rPr>
+          <w:rFonts w:eastAsiaTheme="minorHAnsi"/>
+          <w:color w:val="000000"/>
+          <w:sz w:val="26"/>
+          <w:szCs w:val="26"/>
+          <w:lang w:val="en-US"/>
+        </w:rPr>
+        <w:t xml:space="preserve">    string </w:t>
+      </w:r>
+      <w:proofErr w:type="spellStart"/>
+      <w:r>
+        <w:rPr>
+          <w:rFonts w:eastAsiaTheme="minorHAnsi"/>
+          <w:color w:val="000000"/>
+          <w:sz w:val="26"/>
+          <w:szCs w:val="26"/>
+          <w:lang w:val="en-US"/>
+        </w:rPr>
+        <w:t>sqlquery</w:t>
+      </w:r>
+      <w:proofErr w:type="spellEnd"/>
+      <w:r>
+        <w:rPr>
+          <w:rFonts w:eastAsiaTheme="minorHAnsi"/>
+          <w:color w:val="000000"/>
+          <w:sz w:val="26"/>
+          <w:szCs w:val="26"/>
+          <w:lang w:val="en-US"/>
+        </w:rPr>
+        <w:t xml:space="preserve"> = "SELECT * FROM CALAMVIEC";</w:t>
+      </w:r>
+    </w:p>
+    <w:p>
+      <w:pPr>
+        <w:widowControl/>
+        <w:pBdr>
+          <w:top w:val="single" w:sz="4" w:space="1" w:color="auto"/>
+          <w:left w:val="single" w:sz="4" w:space="4" w:color="auto"/>
+          <w:bottom w:val="single" w:sz="4" w:space="1" w:color="auto"/>
+          <w:right w:val="single" w:sz="4" w:space="4" w:color="auto"/>
+        </w:pBdr>
+        <w:adjustRightInd w:val="0"/>
+        <w:ind w:left="460"/>
+        <w:rPr>
+          <w:rFonts w:eastAsiaTheme="minorHAnsi"/>
+          <w:color w:val="000000"/>
+          <w:sz w:val="26"/>
+          <w:szCs w:val="26"/>
+          <w:lang w:val="en-US"/>
+        </w:rPr>
+      </w:pPr>
+      <w:r>
+        <w:rPr>
+          <w:rFonts w:eastAsiaTheme="minorHAnsi"/>
+          <w:color w:val="000000"/>
+          <w:sz w:val="26"/>
+          <w:szCs w:val="26"/>
+          <w:lang w:val="en-US"/>
+        </w:rPr>
+        <w:t xml:space="preserve">    return </w:t>
+      </w:r>
+      <w:proofErr w:type="spellStart"/>
+      <w:r>
+        <w:rPr>
+          <w:rFonts w:eastAsiaTheme="minorHAnsi"/>
+          <w:color w:val="000000"/>
+          <w:sz w:val="26"/>
+          <w:szCs w:val="26"/>
+          <w:lang w:val="en-US"/>
+        </w:rPr>
+        <w:t>LoadTable</w:t>
+      </w:r>
+      <w:proofErr w:type="spellEnd"/>
+      <w:r>
+        <w:rPr>
+          <w:rFonts w:eastAsiaTheme="minorHAnsi"/>
+          <w:color w:val="000000"/>
+          <w:sz w:val="26"/>
+          <w:szCs w:val="26"/>
+          <w:lang w:val="en-US"/>
+        </w:rPr>
+        <w:t>(</w:t>
+      </w:r>
+      <w:proofErr w:type="spellStart"/>
+      <w:r>
+        <w:rPr>
+          <w:rFonts w:eastAsiaTheme="minorHAnsi"/>
+          <w:color w:val="000000"/>
+          <w:sz w:val="26"/>
+          <w:szCs w:val="26"/>
+          <w:lang w:val="en-US"/>
+        </w:rPr>
+        <w:t>db</w:t>
+      </w:r>
+      <w:proofErr w:type="spellEnd"/>
+      <w:r>
+        <w:rPr>
+          <w:rFonts w:eastAsiaTheme="minorHAnsi"/>
+          <w:color w:val="000000"/>
+          <w:sz w:val="26"/>
+          <w:szCs w:val="26"/>
+          <w:lang w:val="en-US"/>
+        </w:rPr>
+        <w:t xml:space="preserve">, </w:t>
+      </w:r>
+      <w:proofErr w:type="spellStart"/>
+      <w:r>
+        <w:rPr>
+          <w:rFonts w:eastAsiaTheme="minorHAnsi"/>
+          <w:color w:val="000000"/>
+          <w:sz w:val="26"/>
+          <w:szCs w:val="26"/>
+          <w:lang w:val="en-US"/>
+        </w:rPr>
+        <w:t>sqlquery</w:t>
+      </w:r>
+      <w:proofErr w:type="spellEnd"/>
+      <w:r>
+        <w:rPr>
+          <w:rFonts w:eastAsiaTheme="minorHAnsi"/>
+          <w:color w:val="000000"/>
+          <w:sz w:val="26"/>
+          <w:szCs w:val="26"/>
+          <w:lang w:val="en-US"/>
+        </w:rPr>
+        <w:t>);</w:t>
+      </w:r>
+    </w:p>
+    <w:p>
+      <w:pPr>
+        <w:widowControl/>
+        <w:pBdr>
+          <w:top w:val="single" w:sz="4" w:space="1" w:color="auto"/>
+          <w:left w:val="single" w:sz="4" w:space="4" w:color="auto"/>
+          <w:bottom w:val="single" w:sz="4" w:space="1" w:color="auto"/>
+          <w:right w:val="single" w:sz="4" w:space="4" w:color="auto"/>
+        </w:pBdr>
+        <w:adjustRightInd w:val="0"/>
+        <w:ind w:left="460"/>
+        <w:rPr>
+          <w:rFonts w:eastAsiaTheme="minorHAnsi"/>
+          <w:color w:val="000000"/>
+          <w:sz w:val="26"/>
+          <w:szCs w:val="26"/>
+          <w:lang w:val="en-US"/>
+        </w:rPr>
+      </w:pPr>
+      <w:r>
+        <w:rPr>
+          <w:rFonts w:eastAsiaTheme="minorHAnsi"/>
+          <w:color w:val="000000"/>
+          <w:sz w:val="26"/>
+          <w:szCs w:val="26"/>
+          <w:lang w:val="en-US"/>
+        </w:rPr>
+        <w:t>}</w:t>
+      </w:r>
+    </w:p>
+    <w:p>
+      <w:pPr>
+        <w:widowControl/>
+        <w:adjustRightInd w:val="0"/>
+        <w:ind w:left="460"/>
+        <w:rPr>
+          <w:rFonts w:eastAsiaTheme="minorHAnsi"/>
+          <w:color w:val="000000"/>
+          <w:sz w:val="26"/>
+          <w:szCs w:val="26"/>
+          <w:lang w:val="en-US"/>
+        </w:rPr>
+      </w:pPr>
+    </w:p>
+    <w:p>
+      <w:pPr>
+        <w:widowControl/>
+        <w:adjustRightInd w:val="0"/>
+        <w:ind w:left="460"/>
+        <w:rPr>
+          <w:rFonts w:eastAsiaTheme="minorHAnsi"/>
+          <w:color w:val="000000"/>
+          <w:sz w:val="26"/>
+          <w:szCs w:val="26"/>
+          <w:lang w:val="en-US"/>
+        </w:rPr>
+      </w:pPr>
+    </w:p>
+    <w:p>
+      <w:pPr>
+        <w:widowControl/>
+        <w:adjustRightInd w:val="0"/>
+        <w:ind w:left="460"/>
+        <w:rPr>
+          <w:rFonts w:eastAsiaTheme="minorHAnsi"/>
+          <w:color w:val="000000"/>
+          <w:sz w:val="26"/>
+          <w:szCs w:val="26"/>
+          <w:lang w:val="en-US"/>
+        </w:rPr>
+      </w:pPr>
+    </w:p>
+    <w:p>
+      <w:pPr>
+        <w:widowControl/>
+        <w:adjustRightInd w:val="0"/>
+        <w:ind w:left="460"/>
+        <w:rPr>
+          <w:rFonts w:eastAsiaTheme="minorHAnsi"/>
+          <w:color w:val="000000"/>
+          <w:sz w:val="26"/>
+          <w:szCs w:val="26"/>
+          <w:lang w:val="en-US"/>
+        </w:rPr>
+      </w:pPr>
+    </w:p>
+    <w:p>
+      <w:pPr>
+        <w:widowControl/>
+        <w:adjustRightInd w:val="0"/>
+        <w:ind w:left="460"/>
+        <w:rPr>
+          <w:rFonts w:eastAsiaTheme="minorHAnsi"/>
+          <w:color w:val="000000"/>
+          <w:sz w:val="26"/>
+          <w:szCs w:val="26"/>
+          <w:lang w:val="en-US"/>
+        </w:rPr>
+      </w:pPr>
+    </w:p>
+    <w:p>
+      <w:pPr>
+        <w:widowControl/>
+        <w:adjustRightInd w:val="0"/>
+        <w:ind w:left="460"/>
+        <w:rPr>
+          <w:rFonts w:eastAsiaTheme="minorHAnsi"/>
+          <w:color w:val="000000"/>
+          <w:sz w:val="26"/>
+          <w:szCs w:val="26"/>
+          <w:lang w:val="en-US"/>
+        </w:rPr>
+      </w:pPr>
+    </w:p>
+    <w:p>
+      <w:pPr>
+        <w:spacing w:before="209"/>
         <w:rPr>
           <w:sz w:val="24"/>
-          <w:lang w:val="en-US"/>
         </w:rPr>
       </w:pPr>
     </w:p>

</xml_diff>

<commit_message>
change picture data type
</commit_message>
<xml_diff>
--- a/Báo cáo nhóm 12.docx
+++ b/Báo cáo nhóm 12.docx
@@ -360,7 +360,7 @@
           </mc:Choice>
           <mc:Fallback>
             <w:pict>
-              <v:shape w14:anchorId="22BD5589" id="Graphic 1" o:spid="_x0000_s1026" style="position:absolute;margin-left:272.55pt;margin-top:11pt;width:21.65pt;height:.1pt;z-index:251528704;visibility:visible;mso-wrap-style:square;mso-wrap-distance-left:0;mso-wrap-distance-top:0;mso-wrap-distance-right:0;mso-wrap-distance-bottom:0;mso-position-horizontal:absolute;mso-position-horizontal-relative:page;mso-position-vertical:absolute;mso-position-vertical-relative:text;v-text-anchor:top" coordsize="274955,1270" o:gfxdata="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" path="m,l274326,e" filled="f" strokeweight=".33831mm">
+              <v:shape w14:anchorId="63D69F9F" id="Graphic 1" o:spid="_x0000_s1026" style="position:absolute;margin-left:272.55pt;margin-top:11pt;width:21.65pt;height:.1pt;z-index:251528704;visibility:visible;mso-wrap-style:square;mso-wrap-distance-left:0;mso-wrap-distance-top:0;mso-wrap-distance-right:0;mso-wrap-distance-bottom:0;mso-position-horizontal:absolute;mso-position-horizontal-relative:page;mso-position-vertical:absolute;mso-position-vertical-relative:text;v-text-anchor:top" coordsize="274955,1270" o:gfxdata="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" path="m,l274326,e" filled="f" strokeweight=".33831mm">
                 <v:stroke dashstyle="dash"/>
                 <v:path arrowok="t"/>
                 <w10:wrap anchorx="page"/>
@@ -441,7 +441,7 @@
           </mc:Choice>
           <mc:Fallback>
             <w:pict>
-              <v:shape w14:anchorId="5418E1C0" id="Graphic 2" o:spid="_x0000_s1026" style="position:absolute;margin-left:311.55pt;margin-top:11pt;width:21.65pt;height:.1pt;z-index:251530752;visibility:visible;mso-wrap-style:square;mso-wrap-distance-left:0;mso-wrap-distance-top:0;mso-wrap-distance-right:0;mso-wrap-distance-bottom:0;mso-position-horizontal:absolute;mso-position-horizontal-relative:page;mso-position-vertical:absolute;mso-position-vertical-relative:text;v-text-anchor:top" coordsize="274955,1270" o:gfxdata="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" path="m,l274326,e" filled="f" strokeweight=".33831mm">
+              <v:shape w14:anchorId="1925D119" id="Graphic 2" o:spid="_x0000_s1026" style="position:absolute;margin-left:311.55pt;margin-top:11pt;width:21.65pt;height:.1pt;z-index:251530752;visibility:visible;mso-wrap-style:square;mso-wrap-distance-left:0;mso-wrap-distance-top:0;mso-wrap-distance-right:0;mso-wrap-distance-bottom:0;mso-position-horizontal:absolute;mso-position-horizontal-relative:page;mso-position-vertical:absolute;mso-position-vertical-relative:text;v-text-anchor:top" coordsize="274955,1270" o:gfxdata="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" path="m,l274326,e" filled="f" strokeweight=".33831mm">
                 <v:stroke dashstyle="dash"/>
                 <v:path arrowok="t"/>
                 <w10:wrap anchorx="page"/>
@@ -10202,7 +10202,25 @@
                 <w:szCs w:val="26"/>
                 <w:lang w:val="vi-VN"/>
               </w:rPr>
-              <w:t xml:space="preserve"> chính (MaHoaDon)</w:t>
+              <w:t xml:space="preserve"> chính (</w:t>
+            </w:r>
+            <w:proofErr w:type="spellStart"/>
+            <w:r>
+              <w:rPr>
+                <w:sz w:val="26"/>
+                <w:szCs w:val="26"/>
+                <w:lang w:val="vi-VN"/>
+              </w:rPr>
+              <w:t>MaHoaDon</w:t>
+            </w:r>
+            <w:proofErr w:type="spellEnd"/>
+            <w:r>
+              <w:rPr>
+                <w:sz w:val="26"/>
+                <w:szCs w:val="26"/>
+                <w:lang w:val="vi-VN"/>
+              </w:rPr>
+              <w:t>)</w:t>
             </w:r>
           </w:p>
           <w:p>
@@ -11387,23 +11405,84 @@
                 <w:lang w:val="vi-VN"/>
               </w:rPr>
               <w:tab/>
-              <w:t>AnhDaiDien nvarchar(100)</w:t>
-            </w:r>
-            <w:r>
-              <w:rPr>
-                <w:sz w:val="26"/>
-                <w:szCs w:val="26"/>
-                <w:lang w:val="vi-VN"/>
-              </w:rPr>
-              <w:t xml:space="preserve"> NOT</w:t>
-            </w:r>
-            <w:r>
-              <w:rPr>
-                <w:sz w:val="26"/>
-                <w:szCs w:val="26"/>
-                <w:lang w:val="vi-VN"/>
-              </w:rPr>
-              <w:t xml:space="preserve"> null, </w:t>
+            </w:r>
+            <w:proofErr w:type="spellStart"/>
+            <w:r>
+              <w:rPr>
+                <w:sz w:val="26"/>
+                <w:szCs w:val="26"/>
+                <w:lang w:val="vi-VN"/>
+              </w:rPr>
+              <w:t>AnhDaiDien</w:t>
+            </w:r>
+            <w:proofErr w:type="spellEnd"/>
+            <w:r>
+              <w:rPr>
+                <w:sz w:val="26"/>
+                <w:szCs w:val="26"/>
+                <w:lang w:val="vi-VN"/>
+              </w:rPr>
+              <w:t xml:space="preserve"> </w:t>
+            </w:r>
+            <w:proofErr w:type="spellStart"/>
+            <w:r>
+              <w:rPr>
+                <w:sz w:val="26"/>
+                <w:szCs w:val="26"/>
+                <w:lang w:val="en-US"/>
+              </w:rPr>
+              <w:t>varbinary</w:t>
+            </w:r>
+            <w:proofErr w:type="spellEnd"/>
+            <w:r>
+              <w:rPr>
+                <w:sz w:val="26"/>
+                <w:szCs w:val="26"/>
+                <w:lang w:val="en-US"/>
+              </w:rPr>
+              <w:t>(max)</w:t>
+            </w:r>
+            <w:r>
+              <w:rPr>
+                <w:sz w:val="26"/>
+                <w:szCs w:val="26"/>
+                <w:lang w:val="vi-VN"/>
+              </w:rPr>
+              <w:t xml:space="preserve"> </w:t>
+            </w:r>
+            <w:r>
+              <w:rPr>
+                <w:sz w:val="26"/>
+                <w:szCs w:val="26"/>
+                <w:lang w:val="vi-VN"/>
+              </w:rPr>
+              <w:t>NOT</w:t>
+            </w:r>
+            <w:r>
+              <w:rPr>
+                <w:sz w:val="26"/>
+                <w:szCs w:val="26"/>
+                <w:lang w:val="vi-VN"/>
+              </w:rPr>
+              <w:t xml:space="preserve"> </w:t>
+            </w:r>
+            <w:proofErr w:type="spellStart"/>
+            <w:r>
+              <w:rPr>
+                <w:sz w:val="26"/>
+                <w:szCs w:val="26"/>
+                <w:lang w:val="vi-VN"/>
+              </w:rPr>
+              <w:t>null</w:t>
+            </w:r>
+            <w:proofErr w:type="spellEnd"/>
+            <w:r>
+              <w:rPr>
+                <w:sz w:val="26"/>
+                <w:szCs w:val="26"/>
+                <w:lang w:val="vi-VN"/>
+              </w:rPr>
+              <w:t>, </w:t>
             </w:r>
           </w:p>
           <w:p>
@@ -12504,7 +12583,50 @@
                 <w:lang w:val="vi-VN"/>
               </w:rPr>
               <w:tab/>
-              <w:t xml:space="preserve">HinhAnh nvarchar(50) </w:t>
+            </w:r>
+            <w:proofErr w:type="spellStart"/>
+            <w:r>
+              <w:rPr>
+                <w:sz w:val="26"/>
+                <w:szCs w:val="26"/>
+                <w:lang w:val="vi-VN"/>
+              </w:rPr>
+              <w:t>HinhAnh</w:t>
+            </w:r>
+            <w:proofErr w:type="spellEnd"/>
+            <w:r>
+              <w:rPr>
+                <w:sz w:val="26"/>
+                <w:szCs w:val="26"/>
+                <w:lang w:val="vi-VN"/>
+              </w:rPr>
+              <w:t xml:space="preserve"> </w:t>
+            </w:r>
+            <w:proofErr w:type="spellStart"/>
+            <w:r>
+              <w:rPr>
+                <w:sz w:val="26"/>
+                <w:szCs w:val="26"/>
+                <w:lang w:val="en-US"/>
+              </w:rPr>
+              <w:t>varbinary</w:t>
+            </w:r>
+            <w:proofErr w:type="spellEnd"/>
+            <w:r>
+              <w:rPr>
+                <w:sz w:val="26"/>
+                <w:szCs w:val="26"/>
+                <w:lang w:val="en-US"/>
+              </w:rPr>
+              <w:t>(max)</w:t>
+            </w:r>
+            <w:r>
+              <w:rPr>
+                <w:sz w:val="26"/>
+                <w:szCs w:val="26"/>
+                <w:lang w:val="vi-VN"/>
+              </w:rPr>
+              <w:t xml:space="preserve"> </w:t>
             </w:r>
             <w:r>
               <w:rPr>
@@ -23095,7 +23217,6 @@
           <w:color w:val="000000"/>
           <w:sz w:val="26"/>
           <w:szCs w:val="26"/>
-          <w:lang w:val="en-US"/>
         </w:rPr>
       </w:pPr>
     </w:p>
@@ -25764,29 +25885,7 @@
           <w:szCs w:val="26"/>
           <w:lang w:val="en-US"/>
         </w:rPr>
-        <w:t xml:space="preserve">, </w:t>
-      </w:r>
-      <w:proofErr w:type="spellStart"/>
-      <w:r>
-        <w:rPr>
-          <w:rFonts w:eastAsiaTheme="minorHAnsi"/>
-          <w:color w:val="000000"/>
-          <w:sz w:val="26"/>
-          <w:szCs w:val="26"/>
-          <w:lang w:val="en-US"/>
-        </w:rPr>
-        <w:t>sqlquery</w:t>
-      </w:r>
-      <w:proofErr w:type="spellEnd"/>
-      <w:r>
-        <w:rPr>
-          <w:rFonts w:eastAsiaTheme="minorHAnsi"/>
-          <w:color w:val="000000"/>
-          <w:sz w:val="26"/>
-          <w:szCs w:val="26"/>
-          <w:lang w:val="en-US"/>
-        </w:rPr>
-        <w:t>);</w:t>
+        <w:t>, sqlquery);</w:t>
       </w:r>
     </w:p>
     <w:p>
@@ -29283,6 +29382,7 @@
   <w:style w:type="character" w:default="1" w:styleId="DefaultParagraphFont">
     <w:name w:val="Default Paragraph Font"/>
     <w:uiPriority w:val="1"/>
+    <w:semiHidden/>
     <w:unhideWhenUsed/>
   </w:style>
   <w:style w:type="table" w:default="1" w:styleId="TableNormal">

</xml_diff>